<commit_message>
Diseño Código + Documentación
Diseño Código FormBitacora+ Documentación DSS
</commit_message>
<xml_diff>
--- a/Documentación/ProyectoIS 2026 CAJAL-FERNANDEZ.docx
+++ b/Documentación/ProyectoIS 2026 CAJAL-FERNANDEZ.docx
@@ -374,7 +374,15 @@
           <w:sz w:val="30"/>
           <w:szCs w:val="30"/>
         </w:rPr>
-        <w:t xml:space="preserve"> DESCRIPCIÓN FUNCIONAL DEL PRODUCTO Y ALCANCE</w:t>
+        <w:t xml:space="preserve"> D</w:t>
+      </w:r>
+      <w:r>
+        <w:rPr>
+          <w:rFonts w:ascii="Times New Roman" w:eastAsia="Times New Roman" w:hAnsi="Times New Roman" w:cs="Times New Roman"/>
+          <w:sz w:val="30"/>
+          <w:szCs w:val="30"/>
+        </w:rPr>
+        <w:t>escripción funcional del producto y alcance</w:t>
       </w:r>
     </w:p>
     <w:p>
@@ -426,23 +434,7 @@
           <w:rFonts w:ascii="Times New Roman" w:eastAsia="Times New Roman" w:hAnsi="Times New Roman" w:cs="Times New Roman"/>
           <w:color w:val="000000"/>
         </w:rPr>
-        <w:t>Registro/</w:t>
-      </w:r>
-      <w:proofErr w:type="spellStart"/>
-      <w:r>
-        <w:rPr>
-          <w:rFonts w:ascii="Times New Roman" w:eastAsia="Times New Roman" w:hAnsi="Times New Roman" w:cs="Times New Roman"/>
-          <w:color w:val="000000"/>
-        </w:rPr>
-        <w:t>LogIn-Out</w:t>
-      </w:r>
-      <w:proofErr w:type="spellEnd"/>
-      <w:r>
-        <w:rPr>
-          <w:rFonts w:ascii="Times New Roman" w:eastAsia="Times New Roman" w:hAnsi="Times New Roman" w:cs="Times New Roman"/>
-          <w:color w:val="000000"/>
-        </w:rPr>
-        <w:t xml:space="preserve"> de Usuarios</w:t>
+        <w:t>Registro/LogIn-Out de Usuarios</w:t>
       </w:r>
     </w:p>
     <w:p>
@@ -518,9 +510,18 @@
           <w:sz w:val="30"/>
           <w:szCs w:val="30"/>
         </w:rPr>
-        <w:t>1.2 DEFINICIONES, ACRÓNIMOS Y ABREVIACIONES</w:t>
+        <w:t>1.2 D</w:t>
+      </w:r>
+      <w:r>
+        <w:rPr>
+          <w:rFonts w:ascii="Times New Roman" w:eastAsia="Times New Roman" w:hAnsi="Times New Roman" w:cs="Times New Roman"/>
+          <w:sz w:val="30"/>
+          <w:szCs w:val="30"/>
+        </w:rPr>
+        <w:t>efiniciones, acrónimos y abreviaciones</w:t>
       </w:r>
     </w:p>
+    <w:p/>
     <w:p>
       <w:pPr>
         <w:rPr>
@@ -537,7 +538,25 @@
           <w:sz w:val="30"/>
           <w:szCs w:val="30"/>
         </w:rPr>
-        <w:t>1.3 Descripción de las personas participantes en el desarrollo del sistema de información y los usuarios (Roles)</w:t>
+        <w:t>1.3 D</w:t>
+      </w:r>
+      <w:r>
+        <w:rPr>
+          <w:rFonts w:ascii="Times New Roman" w:eastAsia="Times New Roman" w:hAnsi="Times New Roman" w:cs="Times New Roman"/>
+          <w:color w:val="0F4761"/>
+          <w:sz w:val="30"/>
+          <w:szCs w:val="30"/>
+        </w:rPr>
+        <w:t>escripción de las personas participantes en el desarrollo del sistema de información y los usuarios</w:t>
+      </w:r>
+      <w:r>
+        <w:rPr>
+          <w:rFonts w:ascii="Times New Roman" w:eastAsia="Times New Roman" w:hAnsi="Times New Roman" w:cs="Times New Roman"/>
+          <w:color w:val="0F4761"/>
+          <w:sz w:val="30"/>
+          <w:szCs w:val="30"/>
+        </w:rPr>
+        <w:t xml:space="preserve"> (Roles)</w:t>
       </w:r>
     </w:p>
     <w:tbl>
@@ -568,7 +587,7 @@
                 <w:b/>
                 <w:bCs/>
               </w:rPr>
-              <w:t>Roles</w:t>
+              <w:t>Rol</w:t>
             </w:r>
           </w:p>
         </w:tc>
@@ -589,7 +608,7 @@
                 <w:b/>
                 <w:bCs/>
               </w:rPr>
-              <w:t>¿Qué puede hacer?</w:t>
+              <w:t>Responsabilidad/Acceso a:</w:t>
             </w:r>
           </w:p>
         </w:tc>
@@ -665,7 +684,6 @@
         </w:tc>
       </w:tr>
     </w:tbl>
-    <w:p/>
     <w:p>
       <w:pPr>
         <w:pStyle w:val="Ttulo2"/>
@@ -683,7 +701,23 @@
           <w:sz w:val="30"/>
           <w:szCs w:val="30"/>
         </w:rPr>
-        <w:t xml:space="preserve">1.4 MÉTODOS ENCRIPTACIÓN/HASH </w:t>
+        <w:t>1.4 M</w:t>
+      </w:r>
+      <w:r>
+        <w:rPr>
+          <w:rFonts w:ascii="Times New Roman" w:eastAsia="Times New Roman" w:hAnsi="Times New Roman" w:cs="Times New Roman"/>
+          <w:sz w:val="30"/>
+          <w:szCs w:val="30"/>
+        </w:rPr>
+        <w:t>étodos Encriptación/Hash</w:t>
+      </w:r>
+      <w:r>
+        <w:rPr>
+          <w:rFonts w:ascii="Times New Roman" w:eastAsia="Times New Roman" w:hAnsi="Times New Roman" w:cs="Times New Roman"/>
+          <w:sz w:val="30"/>
+          <w:szCs w:val="30"/>
+        </w:rPr>
+        <w:t xml:space="preserve"> </w:t>
       </w:r>
     </w:p>
     <w:p>
@@ -704,21 +738,7 @@
         <w:rPr>
           <w:rFonts w:ascii="Times New Roman" w:hAnsi="Times New Roman" w:cs="Times New Roman"/>
         </w:rPr>
-        <w:t xml:space="preserve">Con el objetivo de garantizar la seguridad de las contraseñas de los usuarios, en este proyecto se aplica el algoritmo SHA-256, encargado de transformar una cadena de texto en un valor de longitud determinado, denominado "hash". Este es un algoritmo de </w:t>
-      </w:r>
-      <w:proofErr w:type="spellStart"/>
-      <w:r>
-        <w:rPr>
-          <w:rFonts w:ascii="Times New Roman" w:hAnsi="Times New Roman" w:cs="Times New Roman"/>
-        </w:rPr>
-        <w:t>hashing</w:t>
-      </w:r>
-      <w:proofErr w:type="spellEnd"/>
-      <w:r>
-        <w:rPr>
-          <w:rFonts w:ascii="Times New Roman" w:hAnsi="Times New Roman" w:cs="Times New Roman"/>
-        </w:rPr>
-        <w:t xml:space="preserve"> unidireccional, lo que significa que no es posible desencriptar el hash para obtener la contraseña original. </w:t>
+        <w:t xml:space="preserve">Con el objetivo de garantizar la seguridad de las contraseñas de los usuarios, en este proyecto se aplica el algoritmo SHA-256, encargado de transformar una cadena de texto en un valor de longitud determinado, denominado "hash". Este es un algoritmo de hashing unidireccional, lo que significa que no es posible desencriptar el hash para obtener la contraseña original. </w:t>
       </w:r>
     </w:p>
     <w:p>
@@ -731,42 +751,14 @@
         <w:rPr>
           <w:rFonts w:ascii="Times New Roman" w:hAnsi="Times New Roman" w:cs="Times New Roman"/>
         </w:rPr>
-        <w:t xml:space="preserve">Tanto para la creación de usuarios como para el logueo en el sistema de estos mismos, se deberá ingresar una clave. Esta clave será </w:t>
-      </w:r>
-      <w:proofErr w:type="spellStart"/>
+        <w:t xml:space="preserve">Tanto para la creación de usuarios como para el logueo en el sistema de estos mismos, se deberá ingresar una clave. Esta clave será hasheada por el algoritmo SHA-256 y será guardada en la base de datos. Un usuario que requiera iniciar sesión deberá ingresar su clave, en la interfaz de Inicio de sesión, el valor que coloque como clave, al seleccionar </w:t>
+      </w:r>
       <w:r>
         <w:rPr>
           <w:rFonts w:ascii="Times New Roman" w:hAnsi="Times New Roman" w:cs="Times New Roman"/>
         </w:rPr>
-        <w:t>hasheada</w:t>
-      </w:r>
-      <w:proofErr w:type="spellEnd"/>
-      <w:r>
-        <w:rPr>
-          <w:rFonts w:ascii="Times New Roman" w:hAnsi="Times New Roman" w:cs="Times New Roman"/>
-        </w:rPr>
-        <w:t xml:space="preserve"> por el algoritmo SHA-256 y será guardada en la base de datos. Un usuario que requiera iniciar sesión deberá ingresar su clave, en la interfaz de Inicio de sesión, el valor que coloque como clave, al seleccionar </w:t>
-      </w:r>
-      <w:r>
-        <w:rPr>
-          <w:rFonts w:ascii="Times New Roman" w:hAnsi="Times New Roman" w:cs="Times New Roman"/>
-        </w:rPr>
         <w:lastRenderedPageBreak/>
-        <w:t xml:space="preserve">“Iniciar Sesión” será </w:t>
-      </w:r>
-      <w:proofErr w:type="spellStart"/>
-      <w:r>
-        <w:rPr>
-          <w:rFonts w:ascii="Times New Roman" w:hAnsi="Times New Roman" w:cs="Times New Roman"/>
-        </w:rPr>
-        <w:t>hasheado</w:t>
-      </w:r>
-      <w:proofErr w:type="spellEnd"/>
-      <w:r>
-        <w:rPr>
-          <w:rFonts w:ascii="Times New Roman" w:hAnsi="Times New Roman" w:cs="Times New Roman"/>
-        </w:rPr>
-        <w:t xml:space="preserve"> y comparado con el valor que se encuentre en la base de datos. Si estos valores coinciden, la sesión es iniciada, en el caso contrario donde no coincidan, se mostrará al usuario un error de contraseña incorrecta. </w:t>
+        <w:t xml:space="preserve">“Iniciar Sesión” será hasheado y comparado con el valor que se encuentre en la base de datos. Si estos valores coinciden, la sesión es iniciada, en el caso contrario donde no coincidan, se mostrará al usuario un error de contraseña incorrecta. </w:t>
       </w:r>
     </w:p>
     <w:p>
@@ -788,25 +780,7 @@
           <w:b/>
           <w:bCs/>
         </w:rPr>
-        <w:t xml:space="preserve">Método de la clase </w:t>
-      </w:r>
-      <w:proofErr w:type="spellStart"/>
-      <w:r>
-        <w:rPr>
-          <w:rFonts w:ascii="Times New Roman" w:hAnsi="Times New Roman" w:cs="Times New Roman"/>
-          <w:b/>
-          <w:bCs/>
-        </w:rPr>
-        <w:t>Encriptador</w:t>
-      </w:r>
-      <w:proofErr w:type="spellEnd"/>
-      <w:r>
-        <w:rPr>
-          <w:rFonts w:ascii="Times New Roman" w:hAnsi="Times New Roman" w:cs="Times New Roman"/>
-          <w:b/>
-          <w:bCs/>
-        </w:rPr>
-        <w:t xml:space="preserve">: </w:t>
+        <w:t xml:space="preserve">Método de la clase Encriptador: </w:t>
       </w:r>
     </w:p>
     <w:p>
@@ -819,21 +793,7 @@
         <w:rPr>
           <w:rFonts w:ascii="Times New Roman" w:hAnsi="Times New Roman" w:cs="Times New Roman"/>
         </w:rPr>
-        <w:t>Hash (</w:t>
-      </w:r>
-      <w:proofErr w:type="spellStart"/>
-      <w:r>
-        <w:rPr>
-          <w:rFonts w:ascii="Times New Roman" w:hAnsi="Times New Roman" w:cs="Times New Roman"/>
-        </w:rPr>
-        <w:t>string</w:t>
-      </w:r>
-      <w:proofErr w:type="spellEnd"/>
-      <w:r>
-        <w:rPr>
-          <w:rFonts w:ascii="Times New Roman" w:hAnsi="Times New Roman" w:cs="Times New Roman"/>
-        </w:rPr>
-        <w:t xml:space="preserve"> input): Este método toma una cadena de texto (como una contraseña en texto plano) y la convierte en un hash de 256 bits utilizando el algoritmo SHA-256. </w:t>
+        <w:t xml:space="preserve">Hash (string input): Este método toma una cadena de texto (como una contraseña en texto plano) y la convierte en un hash de 256 bits utilizando el algoritmo SHA-256. </w:t>
       </w:r>
     </w:p>
     <w:p>
@@ -936,6 +896,201 @@
           <w:szCs w:val="30"/>
         </w:rPr>
       </w:pPr>
+      <w:r>
+        <w:rPr>
+          <w:rFonts w:ascii="Times New Roman" w:eastAsia="Times New Roman" w:hAnsi="Times New Roman" w:cs="Times New Roman"/>
+          <w:sz w:val="30"/>
+          <w:szCs w:val="30"/>
+        </w:rPr>
+        <w:t>1.5 B</w:t>
+      </w:r>
+      <w:r>
+        <w:rPr>
+          <w:rFonts w:ascii="Times New Roman" w:eastAsia="Times New Roman" w:hAnsi="Times New Roman" w:cs="Times New Roman"/>
+          <w:sz w:val="30"/>
+          <w:szCs w:val="30"/>
+        </w:rPr>
+        <w:t>itácora</w:t>
+      </w:r>
+      <w:r>
+        <w:rPr>
+          <w:rFonts w:ascii="Times New Roman" w:eastAsia="Times New Roman" w:hAnsi="Times New Roman" w:cs="Times New Roman"/>
+          <w:sz w:val="30"/>
+          <w:szCs w:val="30"/>
+        </w:rPr>
+        <w:t xml:space="preserve"> </w:t>
+      </w:r>
+    </w:p>
+    <w:p>
+      <w:pPr>
+        <w:pStyle w:val="Ttulo3"/>
+        <w:rPr>
+          <w:rFonts w:ascii="Times New Roman" w:eastAsia="Times New Roman" w:hAnsi="Times New Roman" w:cs="Times New Roman"/>
+        </w:rPr>
+      </w:pPr>
+      <w:r>
+        <w:rPr>
+          <w:rFonts w:ascii="Times New Roman" w:eastAsia="Times New Roman" w:hAnsi="Times New Roman" w:cs="Times New Roman"/>
+        </w:rPr>
+        <w:t xml:space="preserve">1.5.1 </w:t>
+      </w:r>
+      <w:r>
+        <w:rPr>
+          <w:rFonts w:ascii="Times New Roman" w:eastAsia="Times New Roman" w:hAnsi="Times New Roman" w:cs="Times New Roman"/>
+        </w:rPr>
+        <w:t xml:space="preserve">Descripción </w:t>
+      </w:r>
+    </w:p>
+    <w:p>
+      <w:pPr>
+        <w:rPr>
+          <w:rFonts w:ascii="Times New Roman" w:hAnsi="Times New Roman" w:cs="Times New Roman"/>
+        </w:rPr>
+      </w:pPr>
+      <w:r>
+        <w:rPr>
+          <w:rFonts w:ascii="Times New Roman" w:hAnsi="Times New Roman" w:cs="Times New Roman"/>
+        </w:rPr>
+        <w:t>La utilización de la bitácora nos permite llevar un registro de las acciones realizadas dentro del sistema por parte de un usuario del mismo. Cada evento registrado en la bitácora va a tener la fecha y hora en la que se realizó, el correo electrónico del usuario de quien la llevo a cabo, la actividad y la información asociada.</w:t>
+      </w:r>
+    </w:p>
+    <w:p>
+      <w:pPr>
+        <w:pStyle w:val="Prrafodelista"/>
+        <w:numPr>
+          <w:ilvl w:val="0"/>
+          <w:numId w:val="19"/>
+        </w:numPr>
+        <w:rPr>
+          <w:rFonts w:ascii="Times New Roman" w:hAnsi="Times New Roman" w:cs="Times New Roman"/>
+        </w:rPr>
+      </w:pPr>
+      <w:r>
+        <w:rPr>
+          <w:rFonts w:ascii="Times New Roman" w:hAnsi="Times New Roman" w:cs="Times New Roman"/>
+        </w:rPr>
+        <w:t>Fecha: Fecha asociada al sistema al momento de la realización del evento.</w:t>
+      </w:r>
+    </w:p>
+    <w:p>
+      <w:pPr>
+        <w:pStyle w:val="Prrafodelista"/>
+        <w:numPr>
+          <w:ilvl w:val="0"/>
+          <w:numId w:val="19"/>
+        </w:numPr>
+        <w:rPr>
+          <w:rFonts w:ascii="Times New Roman" w:hAnsi="Times New Roman" w:cs="Times New Roman"/>
+        </w:rPr>
+      </w:pPr>
+      <w:r>
+        <w:rPr>
+          <w:rFonts w:ascii="Times New Roman" w:hAnsi="Times New Roman" w:cs="Times New Roman"/>
+        </w:rPr>
+        <w:t>Hora: Hora asociada al sistema al momento de la realización del evento.</w:t>
+      </w:r>
+    </w:p>
+    <w:p>
+      <w:pPr>
+        <w:pStyle w:val="Prrafodelista"/>
+        <w:numPr>
+          <w:ilvl w:val="0"/>
+          <w:numId w:val="19"/>
+        </w:numPr>
+        <w:rPr>
+          <w:rFonts w:ascii="Times New Roman" w:hAnsi="Times New Roman" w:cs="Times New Roman"/>
+        </w:rPr>
+      </w:pPr>
+      <w:r>
+        <w:rPr>
+          <w:rFonts w:ascii="Times New Roman" w:hAnsi="Times New Roman" w:cs="Times New Roman"/>
+        </w:rPr>
+        <w:t>Actividad: Nombre de la acción (Inicio de Sesión, Cierre de Sesión, Alta de Usuario)</w:t>
+      </w:r>
+    </w:p>
+    <w:p>
+      <w:pPr>
+        <w:pStyle w:val="Ttulo3"/>
+        <w:rPr>
+          <w:rFonts w:ascii="Times New Roman" w:eastAsia="Times New Roman" w:hAnsi="Times New Roman" w:cs="Times New Roman"/>
+        </w:rPr>
+      </w:pPr>
+      <w:r>
+        <w:rPr>
+          <w:rFonts w:ascii="Times New Roman" w:eastAsia="Times New Roman" w:hAnsi="Times New Roman" w:cs="Times New Roman"/>
+        </w:rPr>
+        <w:lastRenderedPageBreak/>
+        <w:t>1.5.2</w:t>
+      </w:r>
+      <w:r>
+        <w:rPr>
+          <w:rFonts w:ascii="Times New Roman" w:eastAsia="Times New Roman" w:hAnsi="Times New Roman" w:cs="Times New Roman"/>
+        </w:rPr>
+        <w:t xml:space="preserve"> Pantalla</w:t>
+      </w:r>
+      <w:r>
+        <w:rPr>
+          <w:rFonts w:ascii="Times New Roman" w:eastAsia="Times New Roman" w:hAnsi="Times New Roman" w:cs="Times New Roman"/>
+        </w:rPr>
+        <w:t xml:space="preserve"> BITÁCORA</w:t>
+      </w:r>
+    </w:p>
+    <w:p>
+      <w:pPr>
+        <w:rPr>
+          <w:rFonts w:ascii="Times New Roman" w:hAnsi="Times New Roman" w:cs="Times New Roman"/>
+        </w:rPr>
+      </w:pPr>
+      <w:r>
+        <w:rPr>
+          <w:rFonts w:ascii="Times New Roman" w:hAnsi="Times New Roman" w:cs="Times New Roman"/>
+        </w:rPr>
+        <w:drawing>
+          <wp:inline distT="0" distB="0" distL="0" distR="0" wp14:anchorId="4BECD360" wp14:editId="0D3E8A8B">
+            <wp:extent cx="4204003" cy="2613660"/>
+            <wp:effectExtent l="0" t="0" r="6350" b="0"/>
+            <wp:docPr id="99375917" name="Imagen 1"/>
+            <wp:cNvGraphicFramePr>
+              <a:graphicFrameLocks xmlns:a="http://schemas.openxmlformats.org/drawingml/2006/main" noChangeAspect="1"/>
+            </wp:cNvGraphicFramePr>
+            <a:graphic xmlns:a="http://schemas.openxmlformats.org/drawingml/2006/main">
+              <a:graphicData uri="http://schemas.openxmlformats.org/drawingml/2006/picture">
+                <pic:pic xmlns:pic="http://schemas.openxmlformats.org/drawingml/2006/picture">
+                  <pic:nvPicPr>
+                    <pic:cNvPr id="99375917" name=""/>
+                    <pic:cNvPicPr/>
+                  </pic:nvPicPr>
+                  <pic:blipFill>
+                    <a:blip r:embed="rId10"/>
+                    <a:stretch>
+                      <a:fillRect/>
+                    </a:stretch>
+                  </pic:blipFill>
+                  <pic:spPr>
+                    <a:xfrm>
+                      <a:off x="0" y="0"/>
+                      <a:ext cx="4205919" cy="2614851"/>
+                    </a:xfrm>
+                    <a:prstGeom prst="rect">
+                      <a:avLst/>
+                    </a:prstGeom>
+                  </pic:spPr>
+                </pic:pic>
+              </a:graphicData>
+            </a:graphic>
+          </wp:inline>
+        </w:drawing>
+      </w:r>
+    </w:p>
+    <w:p>
+      <w:pPr>
+        <w:pStyle w:val="Ttulo2"/>
+        <w:rPr>
+          <w:rFonts w:ascii="Times New Roman" w:eastAsia="Times New Roman" w:hAnsi="Times New Roman" w:cs="Times New Roman"/>
+          <w:sz w:val="30"/>
+          <w:szCs w:val="30"/>
+        </w:rPr>
+      </w:pPr>
       <w:bookmarkStart w:id="1" w:name="_heading=h.3016uksryk99" w:colFirst="0" w:colLast="0"/>
       <w:bookmarkEnd w:id="1"/>
       <w:r>
@@ -944,8 +1099,39 @@
           <w:sz w:val="30"/>
           <w:szCs w:val="30"/>
         </w:rPr>
-        <w:lastRenderedPageBreak/>
-        <w:t xml:space="preserve">1.5 DIAGRAMA DE COMPONENTES </w:t>
+        <w:t>1.</w:t>
+      </w:r>
+      <w:r>
+        <w:rPr>
+          <w:rFonts w:ascii="Times New Roman" w:eastAsia="Times New Roman" w:hAnsi="Times New Roman" w:cs="Times New Roman"/>
+          <w:sz w:val="30"/>
+          <w:szCs w:val="30"/>
+        </w:rPr>
+        <w:t>6</w:t>
+      </w:r>
+      <w:r>
+        <w:rPr>
+          <w:rFonts w:ascii="Times New Roman" w:eastAsia="Times New Roman" w:hAnsi="Times New Roman" w:cs="Times New Roman"/>
+          <w:sz w:val="30"/>
+          <w:szCs w:val="30"/>
+        </w:rPr>
+        <w:t xml:space="preserve"> </w:t>
+      </w:r>
+      <w:r>
+        <w:rPr>
+          <w:rFonts w:ascii="Times New Roman" w:eastAsia="Times New Roman" w:hAnsi="Times New Roman" w:cs="Times New Roman"/>
+          <w:sz w:val="30"/>
+          <w:szCs w:val="30"/>
+        </w:rPr>
+        <w:t>Diagrama de componentes</w:t>
+      </w:r>
+      <w:r>
+        <w:rPr>
+          <w:rFonts w:ascii="Times New Roman" w:eastAsia="Times New Roman" w:hAnsi="Times New Roman" w:cs="Times New Roman"/>
+          <w:sz w:val="30"/>
+          <w:szCs w:val="30"/>
+        </w:rPr>
+        <w:t xml:space="preserve"> </w:t>
       </w:r>
     </w:p>
     <w:p>
@@ -957,7 +1143,6 @@
           <w:right w:val="nil"/>
           <w:between w:val="nil"/>
         </w:pBdr>
-        <w:ind w:left="360"/>
         <w:rPr>
           <w:rFonts w:ascii="Times New Roman" w:eastAsia="Times New Roman" w:hAnsi="Times New Roman" w:cs="Times New Roman"/>
           <w:color w:val="000000"/>
@@ -987,7 +1172,7 @@
                     </pic:cNvPicPr>
                   </pic:nvPicPr>
                   <pic:blipFill>
-                    <a:blip r:embed="rId10">
+                    <a:blip r:embed="rId11">
                       <a:extLst>
                         <a:ext uri="{28A0092B-C50C-407E-A947-70E740481C1C}">
                           <a14:useLocalDpi xmlns:a14="http://schemas.microsoft.com/office/drawing/2010/main" val="0"/>
@@ -1030,7 +1215,20 @@
         <w:rPr>
           <w:rFonts w:ascii="Times New Roman" w:eastAsia="Times New Roman" w:hAnsi="Times New Roman" w:cs="Times New Roman"/>
         </w:rPr>
-        <w:t xml:space="preserve">1.5.1 </w:t>
+        <w:lastRenderedPageBreak/>
+        <w:t>1.</w:t>
+      </w:r>
+      <w:r>
+        <w:rPr>
+          <w:rFonts w:ascii="Times New Roman" w:eastAsia="Times New Roman" w:hAnsi="Times New Roman" w:cs="Times New Roman"/>
+        </w:rPr>
+        <w:t>6</w:t>
+      </w:r>
+      <w:r>
+        <w:rPr>
+          <w:rFonts w:ascii="Times New Roman" w:eastAsia="Times New Roman" w:hAnsi="Times New Roman" w:cs="Times New Roman"/>
+        </w:rPr>
+        <w:t xml:space="preserve">.1 </w:t>
       </w:r>
       <w:r>
         <w:rPr>
@@ -1060,7 +1258,7 @@
                     <pic:cNvPicPr/>
                   </pic:nvPicPr>
                   <pic:blipFill>
-                    <a:blip r:embed="rId11"/>
+                    <a:blip r:embed="rId12"/>
                     <a:stretch>
                       <a:fillRect/>
                     </a:stretch>
@@ -1251,7 +1449,6 @@
           <w:bCs/>
           <w:color w:val="000000"/>
         </w:rPr>
-        <w:lastRenderedPageBreak/>
         <w:t>SERVICIO:</w:t>
       </w:r>
       <w:r>
@@ -1264,34 +1461,43 @@
     </w:p>
     <w:p>
       <w:pPr>
-        <w:pStyle w:val="Ttulo2"/>
-        <w:rPr>
-          <w:rFonts w:ascii="Times New Roman" w:eastAsia="Times New Roman" w:hAnsi="Times New Roman" w:cs="Times New Roman"/>
-          <w:sz w:val="30"/>
-          <w:szCs w:val="30"/>
-        </w:rPr>
-      </w:pPr>
-      <w:bookmarkStart w:id="2" w:name="_heading=h.5twoj81j1gka" w:colFirst="0" w:colLast="0"/>
-      <w:bookmarkEnd w:id="2"/>
-      <w:r>
-        <w:rPr>
-          <w:rFonts w:ascii="Times New Roman" w:eastAsia="Times New Roman" w:hAnsi="Times New Roman" w:cs="Times New Roman"/>
-          <w:sz w:val="30"/>
-          <w:szCs w:val="30"/>
-        </w:rPr>
-        <w:t>1.6 MENÚ TENTATIVO DE NAVEGACIÓN DEL SISTEMA</w:t>
+        <w:pStyle w:val="Ttulo3"/>
+        <w:rPr>
+          <w:rFonts w:ascii="Times New Roman" w:eastAsia="Times New Roman" w:hAnsi="Times New Roman" w:cs="Times New Roman"/>
+        </w:rPr>
+      </w:pPr>
+      <w:r>
+        <w:rPr>
+          <w:rFonts w:ascii="Times New Roman" w:eastAsia="Times New Roman" w:hAnsi="Times New Roman" w:cs="Times New Roman"/>
+        </w:rPr>
+        <w:t>1.6.2 Diagrama Secuencia del Sistema Persistencia de Datos</w:t>
       </w:r>
     </w:p>
     <w:p>
-      <w:r>
-        <w:rPr>
+      <w:pPr>
+        <w:pBdr>
+          <w:top w:val="nil"/>
+          <w:left w:val="nil"/>
+          <w:bottom w:val="nil"/>
+          <w:right w:val="nil"/>
+          <w:between w:val="nil"/>
+        </w:pBdr>
+        <w:rPr>
+          <w:rFonts w:ascii="Times New Roman" w:eastAsia="Times New Roman" w:hAnsi="Times New Roman" w:cs="Times New Roman"/>
+          <w:color w:val="000000"/>
+        </w:rPr>
+      </w:pPr>
+      <w:r>
+        <w:rPr>
+          <w:rFonts w:ascii="Times New Roman" w:eastAsia="Times New Roman" w:hAnsi="Times New Roman" w:cs="Times New Roman"/>
           <w:noProof/>
+          <w:color w:val="000000"/>
         </w:rPr>
         <w:drawing>
-          <wp:inline distT="0" distB="0" distL="0" distR="0" wp14:anchorId="54FB448B" wp14:editId="0D44397D">
-            <wp:extent cx="4572000" cy="2374049"/>
-            <wp:effectExtent l="0" t="0" r="0" b="7620"/>
-            <wp:docPr id="1218404601" name="Imagen 1"/>
+          <wp:inline distT="0" distB="0" distL="0" distR="0" wp14:anchorId="6EB8EEBB" wp14:editId="6A760582">
+            <wp:extent cx="4800600" cy="3304662"/>
+            <wp:effectExtent l="0" t="0" r="0" b="0"/>
+            <wp:docPr id="1117269562" name="Imagen 7"/>
             <wp:cNvGraphicFramePr>
               <a:graphicFrameLocks xmlns:a="http://schemas.openxmlformats.org/drawingml/2006/main" noChangeAspect="1"/>
             </wp:cNvGraphicFramePr>
@@ -1299,110 +1505,7 @@
               <a:graphicData uri="http://schemas.openxmlformats.org/drawingml/2006/picture">
                 <pic:pic xmlns:pic="http://schemas.openxmlformats.org/drawingml/2006/picture">
                   <pic:nvPicPr>
-                    <pic:cNvPr id="0" name="Picture 1"/>
-                    <pic:cNvPicPr>
-                      <a:picLocks noChangeAspect="1" noChangeArrowheads="1"/>
-                    </pic:cNvPicPr>
-                  </pic:nvPicPr>
-                  <pic:blipFill>
-                    <a:blip r:embed="rId12">
-                      <a:extLst>
-                        <a:ext uri="{28A0092B-C50C-407E-A947-70E740481C1C}">
-                          <a14:useLocalDpi xmlns:a14="http://schemas.microsoft.com/office/drawing/2010/main" val="0"/>
-                        </a:ext>
-                      </a:extLst>
-                    </a:blip>
-                    <a:srcRect/>
-                    <a:stretch>
-                      <a:fillRect/>
-                    </a:stretch>
-                  </pic:blipFill>
-                  <pic:spPr bwMode="auto">
-                    <a:xfrm>
-                      <a:off x="0" y="0"/>
-                      <a:ext cx="4580344" cy="2378382"/>
-                    </a:xfrm>
-                    <a:prstGeom prst="rect">
-                      <a:avLst/>
-                    </a:prstGeom>
-                    <a:noFill/>
-                    <a:ln>
-                      <a:noFill/>
-                    </a:ln>
-                  </pic:spPr>
-                </pic:pic>
-              </a:graphicData>
-            </a:graphic>
-          </wp:inline>
-        </w:drawing>
-      </w:r>
-    </w:p>
-    <w:p>
-      <w:pPr>
-        <w:pStyle w:val="Ttulo2"/>
-        <w:rPr>
-          <w:rFonts w:ascii="Times New Roman" w:eastAsia="Times New Roman" w:hAnsi="Times New Roman" w:cs="Times New Roman"/>
-          <w:sz w:val="30"/>
-          <w:szCs w:val="30"/>
-        </w:rPr>
-      </w:pPr>
-      <w:r>
-        <w:rPr>
-          <w:rFonts w:ascii="Times New Roman" w:eastAsia="Times New Roman" w:hAnsi="Times New Roman" w:cs="Times New Roman"/>
-          <w:sz w:val="30"/>
-          <w:szCs w:val="30"/>
-        </w:rPr>
-        <w:lastRenderedPageBreak/>
-        <w:t>1.</w:t>
-      </w:r>
-      <w:r>
-        <w:rPr>
-          <w:rFonts w:ascii="Times New Roman" w:eastAsia="Times New Roman" w:hAnsi="Times New Roman" w:cs="Times New Roman"/>
-          <w:sz w:val="30"/>
-          <w:szCs w:val="30"/>
-        </w:rPr>
-        <w:t>7</w:t>
-      </w:r>
-      <w:r>
-        <w:rPr>
-          <w:rFonts w:ascii="Times New Roman" w:eastAsia="Times New Roman" w:hAnsi="Times New Roman" w:cs="Times New Roman"/>
-          <w:sz w:val="30"/>
-          <w:szCs w:val="30"/>
-        </w:rPr>
-        <w:t xml:space="preserve"> DIAGRAMA DE CLASES </w:t>
-      </w:r>
-      <w:bookmarkStart w:id="3" w:name="_heading=h.j8wddxeeggtw" w:colFirst="0" w:colLast="0"/>
-      <w:bookmarkEnd w:id="3"/>
-    </w:p>
-    <w:p>
-      <w:pPr>
-        <w:pStyle w:val="Ttulo2"/>
-        <w:rPr>
-          <w:rFonts w:ascii="Times New Roman" w:eastAsia="Times New Roman" w:hAnsi="Times New Roman" w:cs="Times New Roman"/>
-          <w:sz w:val="30"/>
-          <w:szCs w:val="30"/>
-        </w:rPr>
-      </w:pPr>
-      <w:r>
-        <w:rPr>
-          <w:rFonts w:ascii="Times New Roman" w:eastAsia="Times New Roman" w:hAnsi="Times New Roman" w:cs="Times New Roman"/>
-          <w:noProof/>
-          <w:sz w:val="30"/>
-          <w:szCs w:val="30"/>
-        </w:rPr>
-        <w:drawing>
-          <wp:inline distT="0" distB="0" distL="0" distR="0" wp14:anchorId="51A6F019" wp14:editId="6B06AD93">
-            <wp:extent cx="4648200" cy="4770120"/>
-            <wp:effectExtent l="0" t="0" r="0" b="0"/>
-            <wp:docPr id="2082062077" name="Imagen 4"/>
-            <wp:cNvGraphicFramePr>
-              <a:graphicFrameLocks xmlns:a="http://schemas.openxmlformats.org/drawingml/2006/main" noChangeAspect="1"/>
-            </wp:cNvGraphicFramePr>
-            <a:graphic xmlns:a="http://schemas.openxmlformats.org/drawingml/2006/main">
-              <a:graphicData uri="http://schemas.openxmlformats.org/drawingml/2006/picture">
-                <pic:pic xmlns:pic="http://schemas.openxmlformats.org/drawingml/2006/picture">
-                  <pic:nvPicPr>
-                    <pic:cNvPr id="0" name="Picture 4"/>
+                    <pic:cNvPr id="0" name="Picture 7"/>
                     <pic:cNvPicPr>
                       <a:picLocks noChangeAspect="1" noChangeArrowheads="1"/>
                     </pic:cNvPicPr>
@@ -1423,7 +1526,7 @@
                   <pic:spPr bwMode="auto">
                     <a:xfrm>
                       <a:off x="0" y="0"/>
-                      <a:ext cx="4648200" cy="4770120"/>
+                      <a:ext cx="4801958" cy="3305597"/>
                     </a:xfrm>
                     <a:prstGeom prst="rect">
                       <a:avLst/>
@@ -1440,29 +1543,25 @@
         </w:drawing>
       </w:r>
     </w:p>
-    <w:p/>
     <w:p>
       <w:pPr>
         <w:pStyle w:val="Ttulo2"/>
-        <w:rPr>
-          <w:rFonts w:ascii="Times New Roman" w:eastAsia="Times New Roman" w:hAnsi="Times New Roman" w:cs="Times New Roman"/>
-        </w:rPr>
-      </w:pPr>
-      <w:r>
         <w:rPr>
           <w:rFonts w:ascii="Times New Roman" w:eastAsia="Times New Roman" w:hAnsi="Times New Roman" w:cs="Times New Roman"/>
           <w:sz w:val="30"/>
           <w:szCs w:val="30"/>
         </w:rPr>
-        <w:t>1.</w:t>
-      </w:r>
+      </w:pPr>
+      <w:bookmarkStart w:id="2" w:name="_heading=h.5twoj81j1gka" w:colFirst="0" w:colLast="0"/>
+      <w:bookmarkEnd w:id="2"/>
       <w:r>
         <w:rPr>
           <w:rFonts w:ascii="Times New Roman" w:eastAsia="Times New Roman" w:hAnsi="Times New Roman" w:cs="Times New Roman"/>
           <w:sz w:val="30"/>
           <w:szCs w:val="30"/>
         </w:rPr>
-        <w:t>8</w:t>
+        <w:lastRenderedPageBreak/>
+        <w:t>1.</w:t>
       </w:r>
       <w:r>
         <w:rPr>
@@ -1470,24 +1569,338 @@
           <w:sz w:val="30"/>
           <w:szCs w:val="30"/>
         </w:rPr>
-        <w:t xml:space="preserve"> DIAGRAMA EN CAPAS </w:t>
+        <w:t>7</w:t>
+      </w:r>
+      <w:r>
+        <w:rPr>
+          <w:rFonts w:ascii="Times New Roman" w:eastAsia="Times New Roman" w:hAnsi="Times New Roman" w:cs="Times New Roman"/>
+          <w:sz w:val="30"/>
+          <w:szCs w:val="30"/>
+        </w:rPr>
+        <w:t xml:space="preserve"> M</w:t>
+      </w:r>
+      <w:r>
+        <w:rPr>
+          <w:rFonts w:ascii="Times New Roman" w:eastAsia="Times New Roman" w:hAnsi="Times New Roman" w:cs="Times New Roman"/>
+          <w:sz w:val="30"/>
+          <w:szCs w:val="30"/>
+        </w:rPr>
+        <w:t>enú</w:t>
+      </w:r>
+      <w:r>
+        <w:rPr>
+          <w:rFonts w:ascii="Times New Roman" w:eastAsia="Times New Roman" w:hAnsi="Times New Roman" w:cs="Times New Roman"/>
+          <w:sz w:val="30"/>
+          <w:szCs w:val="30"/>
+        </w:rPr>
+        <w:t xml:space="preserve"> </w:t>
+      </w:r>
+      <w:r>
+        <w:rPr>
+          <w:rFonts w:ascii="Times New Roman" w:eastAsia="Times New Roman" w:hAnsi="Times New Roman" w:cs="Times New Roman"/>
+          <w:sz w:val="30"/>
+          <w:szCs w:val="30"/>
+        </w:rPr>
+        <w:t>tentativo de navegación del sistema</w:t>
       </w:r>
     </w:p>
     <w:p>
       <w:pPr>
         <w:rPr>
           <w:rFonts w:ascii="Times New Roman" w:eastAsia="Times New Roman" w:hAnsi="Times New Roman" w:cs="Times New Roman"/>
-        </w:rPr>
-      </w:pPr>
-      <w:r>
-        <w:rPr>
-          <w:rFonts w:ascii="Times New Roman" w:eastAsia="Times New Roman" w:hAnsi="Times New Roman" w:cs="Times New Roman"/>
-        </w:rPr>
-        <w:t>Idem punto anterior por partes utilizando las capas mencionadas en el Diagrama de Componentes</w:t>
+          <w:sz w:val="30"/>
+          <w:szCs w:val="30"/>
+        </w:rPr>
+      </w:pPr>
+      <w:r>
+        <w:rPr>
+          <w:noProof/>
+        </w:rPr>
+        <w:drawing>
+          <wp:inline distT="0" distB="0" distL="0" distR="0" wp14:anchorId="268C9BD2" wp14:editId="72DB25D0">
+            <wp:extent cx="3909060" cy="2029812"/>
+            <wp:effectExtent l="0" t="0" r="0" b="8890"/>
+            <wp:docPr id="1218404601" name="Imagen 1"/>
+            <wp:cNvGraphicFramePr>
+              <a:graphicFrameLocks xmlns:a="http://schemas.openxmlformats.org/drawingml/2006/main" noChangeAspect="1"/>
+            </wp:cNvGraphicFramePr>
+            <a:graphic xmlns:a="http://schemas.openxmlformats.org/drawingml/2006/main">
+              <a:graphicData uri="http://schemas.openxmlformats.org/drawingml/2006/picture">
+                <pic:pic xmlns:pic="http://schemas.openxmlformats.org/drawingml/2006/picture">
+                  <pic:nvPicPr>
+                    <pic:cNvPr id="0" name="Picture 1"/>
+                    <pic:cNvPicPr>
+                      <a:picLocks noChangeAspect="1" noChangeArrowheads="1"/>
+                    </pic:cNvPicPr>
+                  </pic:nvPicPr>
+                  <pic:blipFill>
+                    <a:blip r:embed="rId14">
+                      <a:extLst>
+                        <a:ext uri="{28A0092B-C50C-407E-A947-70E740481C1C}">
+                          <a14:useLocalDpi xmlns:a14="http://schemas.microsoft.com/office/drawing/2010/main" val="0"/>
+                        </a:ext>
+                      </a:extLst>
+                    </a:blip>
+                    <a:srcRect/>
+                    <a:stretch>
+                      <a:fillRect/>
+                    </a:stretch>
+                  </pic:blipFill>
+                  <pic:spPr bwMode="auto">
+                    <a:xfrm>
+                      <a:off x="0" y="0"/>
+                      <a:ext cx="3926110" cy="2038666"/>
+                    </a:xfrm>
+                    <a:prstGeom prst="rect">
+                      <a:avLst/>
+                    </a:prstGeom>
+                    <a:noFill/>
+                    <a:ln>
+                      <a:noFill/>
+                    </a:ln>
+                  </pic:spPr>
+                </pic:pic>
+              </a:graphicData>
+            </a:graphic>
+          </wp:inline>
+        </w:drawing>
       </w:r>
     </w:p>
     <w:p>
       <w:pPr>
+        <w:pStyle w:val="Ttulo2"/>
+        <w:rPr>
+          <w:rFonts w:ascii="Times New Roman" w:eastAsia="Times New Roman" w:hAnsi="Times New Roman" w:cs="Times New Roman"/>
+          <w:sz w:val="30"/>
+          <w:szCs w:val="30"/>
+        </w:rPr>
+      </w:pPr>
+      <w:r>
+        <w:br/>
+      </w:r>
+      <w:r>
+        <w:rPr>
+          <w:rFonts w:ascii="Times New Roman" w:eastAsia="Times New Roman" w:hAnsi="Times New Roman" w:cs="Times New Roman"/>
+          <w:sz w:val="30"/>
+          <w:szCs w:val="30"/>
+        </w:rPr>
+        <w:t>1.</w:t>
+      </w:r>
+      <w:r>
+        <w:rPr>
+          <w:rFonts w:ascii="Times New Roman" w:eastAsia="Times New Roman" w:hAnsi="Times New Roman" w:cs="Times New Roman"/>
+          <w:sz w:val="30"/>
+          <w:szCs w:val="30"/>
+        </w:rPr>
+        <w:t>8</w:t>
+      </w:r>
+      <w:r>
+        <w:rPr>
+          <w:rFonts w:ascii="Times New Roman" w:eastAsia="Times New Roman" w:hAnsi="Times New Roman" w:cs="Times New Roman"/>
+          <w:sz w:val="30"/>
+          <w:szCs w:val="30"/>
+        </w:rPr>
+        <w:t xml:space="preserve"> </w:t>
+      </w:r>
+      <w:r>
+        <w:rPr>
+          <w:rFonts w:ascii="Times New Roman" w:eastAsia="Times New Roman" w:hAnsi="Times New Roman" w:cs="Times New Roman"/>
+          <w:sz w:val="30"/>
+          <w:szCs w:val="30"/>
+        </w:rPr>
+        <w:t>Diagrama de Clases</w:t>
+      </w:r>
+      <w:r>
+        <w:t xml:space="preserve"> </w:t>
+      </w:r>
+      <w:bookmarkStart w:id="3" w:name="_heading=h.j8wddxeeggtw" w:colFirst="0" w:colLast="0"/>
+      <w:bookmarkEnd w:id="3"/>
+    </w:p>
+    <w:p>
+      <w:r>
+        <w:rPr>
+          <w:noProof/>
+        </w:rPr>
+        <w:drawing>
+          <wp:inline distT="0" distB="0" distL="0" distR="0" wp14:anchorId="4B190610" wp14:editId="6480EB4A">
+            <wp:extent cx="4213860" cy="4324388"/>
+            <wp:effectExtent l="0" t="0" r="0" b="0"/>
+            <wp:docPr id="1147981262" name="Imagen 8"/>
+            <wp:cNvGraphicFramePr>
+              <a:graphicFrameLocks xmlns:a="http://schemas.openxmlformats.org/drawingml/2006/main" noChangeAspect="1"/>
+            </wp:cNvGraphicFramePr>
+            <a:graphic xmlns:a="http://schemas.openxmlformats.org/drawingml/2006/main">
+              <a:graphicData uri="http://schemas.openxmlformats.org/drawingml/2006/picture">
+                <pic:pic xmlns:pic="http://schemas.openxmlformats.org/drawingml/2006/picture">
+                  <pic:nvPicPr>
+                    <pic:cNvPr id="0" name="Picture 8"/>
+                    <pic:cNvPicPr>
+                      <a:picLocks noChangeAspect="1" noChangeArrowheads="1"/>
+                    </pic:cNvPicPr>
+                  </pic:nvPicPr>
+                  <pic:blipFill>
+                    <a:blip r:embed="rId15">
+                      <a:extLst>
+                        <a:ext uri="{28A0092B-C50C-407E-A947-70E740481C1C}">
+                          <a14:useLocalDpi xmlns:a14="http://schemas.microsoft.com/office/drawing/2010/main" val="0"/>
+                        </a:ext>
+                      </a:extLst>
+                    </a:blip>
+                    <a:srcRect/>
+                    <a:stretch>
+                      <a:fillRect/>
+                    </a:stretch>
+                  </pic:blipFill>
+                  <pic:spPr bwMode="auto">
+                    <a:xfrm>
+                      <a:off x="0" y="0"/>
+                      <a:ext cx="4222183" cy="4332929"/>
+                    </a:xfrm>
+                    <a:prstGeom prst="rect">
+                      <a:avLst/>
+                    </a:prstGeom>
+                    <a:noFill/>
+                    <a:ln>
+                      <a:noFill/>
+                    </a:ln>
+                  </pic:spPr>
+                </pic:pic>
+              </a:graphicData>
+            </a:graphic>
+          </wp:inline>
+        </w:drawing>
+      </w:r>
+    </w:p>
+    <w:p>
+      <w:pPr>
+        <w:pStyle w:val="Ttulo2"/>
+        <w:rPr>
+          <w:rFonts w:ascii="Times New Roman" w:eastAsia="Times New Roman" w:hAnsi="Times New Roman" w:cs="Times New Roman"/>
+          <w:sz w:val="30"/>
+          <w:szCs w:val="30"/>
+        </w:rPr>
+      </w:pPr>
+      <w:r>
+        <w:rPr>
+          <w:rFonts w:ascii="Times New Roman" w:eastAsia="Times New Roman" w:hAnsi="Times New Roman" w:cs="Times New Roman"/>
+          <w:sz w:val="30"/>
+          <w:szCs w:val="30"/>
+        </w:rPr>
+        <w:lastRenderedPageBreak/>
+        <w:t>1.9 D</w:t>
+      </w:r>
+      <w:r>
+        <w:rPr>
+          <w:rFonts w:ascii="Times New Roman" w:eastAsia="Times New Roman" w:hAnsi="Times New Roman" w:cs="Times New Roman"/>
+          <w:sz w:val="30"/>
+          <w:szCs w:val="30"/>
+        </w:rPr>
+        <w:t>er</w:t>
+      </w:r>
+    </w:p>
+    <w:p>
+      <w:r>
+        <w:drawing>
+          <wp:inline distT="0" distB="0" distL="0" distR="0" wp14:anchorId="2AC78D1F" wp14:editId="49230B1D">
+            <wp:extent cx="1935480" cy="2780297"/>
+            <wp:effectExtent l="0" t="0" r="7620" b="1270"/>
+            <wp:docPr id="87819319" name="Imagen 1"/>
+            <wp:cNvGraphicFramePr>
+              <a:graphicFrameLocks xmlns:a="http://schemas.openxmlformats.org/drawingml/2006/main" noChangeAspect="1"/>
+            </wp:cNvGraphicFramePr>
+            <a:graphic xmlns:a="http://schemas.openxmlformats.org/drawingml/2006/main">
+              <a:graphicData uri="http://schemas.openxmlformats.org/drawingml/2006/picture">
+                <pic:pic xmlns:pic="http://schemas.openxmlformats.org/drawingml/2006/picture">
+                  <pic:nvPicPr>
+                    <pic:cNvPr id="87819319" name=""/>
+                    <pic:cNvPicPr/>
+                  </pic:nvPicPr>
+                  <pic:blipFill rotWithShape="1">
+                    <a:blip r:embed="rId16"/>
+                    <a:srcRect l="4836" t="2789" r="7909" b="5910"/>
+                    <a:stretch>
+                      <a:fillRect/>
+                    </a:stretch>
+                  </pic:blipFill>
+                  <pic:spPr bwMode="auto">
+                    <a:xfrm>
+                      <a:off x="0" y="0"/>
+                      <a:ext cx="1938761" cy="2785009"/>
+                    </a:xfrm>
+                    <a:prstGeom prst="rect">
+                      <a:avLst/>
+                    </a:prstGeom>
+                    <a:ln>
+                      <a:noFill/>
+                    </a:ln>
+                    <a:extLst>
+                      <a:ext uri="{53640926-AAD7-44D8-BBD7-CCE9431645EC}">
+                        <a14:shadowObscured xmlns:a14="http://schemas.microsoft.com/office/drawing/2010/main"/>
+                      </a:ext>
+                    </a:extLst>
+                  </pic:spPr>
+                </pic:pic>
+              </a:graphicData>
+            </a:graphic>
+          </wp:inline>
+        </w:drawing>
+      </w:r>
+    </w:p>
+    <w:p>
+      <w:pPr>
+        <w:pStyle w:val="Ttulo2"/>
+        <w:rPr>
+          <w:rFonts w:ascii="Times New Roman" w:eastAsia="Times New Roman" w:hAnsi="Times New Roman" w:cs="Times New Roman"/>
+        </w:rPr>
+      </w:pPr>
+      <w:r>
+        <w:rPr>
+          <w:rFonts w:ascii="Times New Roman" w:eastAsia="Times New Roman" w:hAnsi="Times New Roman" w:cs="Times New Roman"/>
+          <w:sz w:val="30"/>
+          <w:szCs w:val="30"/>
+        </w:rPr>
+        <w:t>1.</w:t>
+      </w:r>
+      <w:r>
+        <w:rPr>
+          <w:rFonts w:ascii="Times New Roman" w:eastAsia="Times New Roman" w:hAnsi="Times New Roman" w:cs="Times New Roman"/>
+          <w:sz w:val="30"/>
+          <w:szCs w:val="30"/>
+        </w:rPr>
+        <w:t>10</w:t>
+      </w:r>
+      <w:r>
+        <w:rPr>
+          <w:rFonts w:ascii="Times New Roman" w:eastAsia="Times New Roman" w:hAnsi="Times New Roman" w:cs="Times New Roman"/>
+          <w:sz w:val="30"/>
+          <w:szCs w:val="30"/>
+        </w:rPr>
+        <w:t xml:space="preserve"> D</w:t>
+      </w:r>
+      <w:r>
+        <w:rPr>
+          <w:rFonts w:ascii="Times New Roman" w:eastAsia="Times New Roman" w:hAnsi="Times New Roman" w:cs="Times New Roman"/>
+          <w:sz w:val="30"/>
+          <w:szCs w:val="30"/>
+        </w:rPr>
+        <w:t>iagrama en Capas</w:t>
+      </w:r>
+    </w:p>
+    <w:p>
+      <w:pPr>
+        <w:rPr>
+          <w:rFonts w:ascii="Times New Roman" w:eastAsia="Times New Roman" w:hAnsi="Times New Roman" w:cs="Times New Roman"/>
+        </w:rPr>
+      </w:pPr>
+      <w:r>
+        <w:rPr>
+          <w:rFonts w:ascii="Times New Roman" w:eastAsia="Times New Roman" w:hAnsi="Times New Roman" w:cs="Times New Roman"/>
+        </w:rPr>
+        <w:t>Idem punto anterior por partes utilizando las capas mencionadas en el Diagrama de Componentes</w:t>
+      </w:r>
+    </w:p>
+    <w:p>
+      <w:pPr>
         <w:pStyle w:val="Ttulo1"/>
         <w:rPr>
           <w:rFonts w:ascii="Times New Roman" w:eastAsia="Times New Roman" w:hAnsi="Times New Roman" w:cs="Times New Roman"/>
@@ -1499,7 +1912,6 @@
         <w:rPr>
           <w:rFonts w:ascii="Times New Roman" w:eastAsia="Times New Roman" w:hAnsi="Times New Roman" w:cs="Times New Roman"/>
         </w:rPr>
-        <w:lastRenderedPageBreak/>
         <w:t xml:space="preserve">2. GESTIÓN DE LOG IN / LOG OUT DEL SISTEMA </w:t>
       </w:r>
     </w:p>
@@ -1635,7 +2047,15 @@
           <w:rFonts w:ascii="Times New Roman" w:eastAsia="Times New Roman" w:hAnsi="Times New Roman" w:cs="Times New Roman"/>
           <w:color w:val="000000"/>
         </w:rPr>
-        <w:t xml:space="preserve"> Al iniciar el sistema, se carga la interfaz de LogIn y se presenta al usuario como pantalla principal. En esta etapa no hay ninguna sesión activa ni conexión abierta con la base de datos. Por el momento no se realiza ninguna validación de permisos hasta que el usuario intenta autenticarse. Este enfoque busca minimizar el uso de recursos y mantener la seguridad hasta que se confirme la identidad del usuario. </w:t>
+        <w:t xml:space="preserve"> Al iniciar el sistema, se carga la interfaz de LogIn y se presenta al usuario como pantalla principal. En esta etapa no </w:t>
+      </w:r>
+      <w:r>
+        <w:rPr>
+          <w:rFonts w:ascii="Times New Roman" w:eastAsia="Times New Roman" w:hAnsi="Times New Roman" w:cs="Times New Roman"/>
+          <w:color w:val="000000"/>
+        </w:rPr>
+        <w:lastRenderedPageBreak/>
+        <w:t xml:space="preserve">hay ninguna sesión activa ni conexión abierta con la base de datos. Por el momento no se realiza ninguna validación de permisos hasta que el usuario intenta autenticarse. Este enfoque busca minimizar el uso de recursos y mantener la seguridad hasta que se confirme la identidad del usuario. </w:t>
       </w:r>
     </w:p>
     <w:p>
@@ -1889,28 +2309,7 @@
           <w:bCs/>
           <w:color w:val="000000"/>
         </w:rPr>
-        <w:lastRenderedPageBreak/>
-        <w:t>Proceso de Log-</w:t>
-      </w:r>
-      <w:proofErr w:type="spellStart"/>
-      <w:r>
-        <w:rPr>
-          <w:rFonts w:ascii="Times New Roman" w:eastAsia="Times New Roman" w:hAnsi="Times New Roman" w:cs="Times New Roman"/>
-          <w:b/>
-          <w:bCs/>
-          <w:color w:val="000000"/>
-        </w:rPr>
-        <w:t>Out</w:t>
-      </w:r>
-      <w:proofErr w:type="spellEnd"/>
-      <w:r>
-        <w:rPr>
-          <w:rFonts w:ascii="Times New Roman" w:eastAsia="Times New Roman" w:hAnsi="Times New Roman" w:cs="Times New Roman"/>
-          <w:b/>
-          <w:bCs/>
-          <w:color w:val="000000"/>
-        </w:rPr>
-        <w:t>:</w:t>
+        <w:t>Proceso de Log-Out:</w:t>
       </w:r>
       <w:r>
         <w:rPr>
@@ -2011,7 +2410,7 @@
                     </pic:cNvPicPr>
                   </pic:nvPicPr>
                   <pic:blipFill>
-                    <a:blip r:embed="rId14">
+                    <a:blip r:embed="rId17">
                       <a:extLst>
                         <a:ext uri="{28A0092B-C50C-407E-A947-70E740481C1C}">
                           <a14:useLocalDpi xmlns:a14="http://schemas.microsoft.com/office/drawing/2010/main" val="0"/>
@@ -2222,6 +2621,7 @@
                 <w:bCs/>
                 <w:color w:val="000000"/>
               </w:rPr>
+              <w:lastRenderedPageBreak/>
               <w:t xml:space="preserve">DESCRIPCIÓN: </w:t>
             </w:r>
             <w:r>
@@ -2720,27 +3120,7 @@
                 <w:sz w:val="22"/>
                 <w:szCs w:val="22"/>
               </w:rPr>
-              <w:t xml:space="preserve"> </w:t>
-            </w:r>
-            <w:proofErr w:type="gramStart"/>
-            <w:r>
-              <w:rPr>
-                <w:rFonts w:ascii="Times New Roman" w:eastAsia="Times New Roman" w:hAnsi="Times New Roman" w:cs="Times New Roman"/>
-                <w:color w:val="000000"/>
-                <w:sz w:val="22"/>
-                <w:szCs w:val="22"/>
-              </w:rPr>
-              <w:t>del mismo</w:t>
-            </w:r>
-            <w:proofErr w:type="gramEnd"/>
-            <w:r>
-              <w:rPr>
-                <w:rFonts w:ascii="Times New Roman" w:eastAsia="Times New Roman" w:hAnsi="Times New Roman" w:cs="Times New Roman"/>
-                <w:color w:val="000000"/>
-                <w:sz w:val="22"/>
-                <w:szCs w:val="22"/>
-              </w:rPr>
-              <w:t>.</w:t>
+              <w:t xml:space="preserve"> del mismo.</w:t>
             </w:r>
           </w:p>
           <w:p>
@@ -2831,7 +3211,7 @@
                 <w:sz w:val="22"/>
                 <w:szCs w:val="22"/>
               </w:rPr>
-              <w:t>El sistema muestra en pantalla mensaje de “Inicio de sesión exitoso</w:t>
+              <w:t>El sistema muestra en pantalla mensaje de “</w:t>
             </w:r>
             <w:r>
               <w:rPr>
@@ -2840,7 +3220,7 @@
                 <w:sz w:val="22"/>
                 <w:szCs w:val="22"/>
               </w:rPr>
-              <w:t xml:space="preserve">” </w:t>
+              <w:t>El usuario fue logueado exitosamente</w:t>
             </w:r>
             <w:r>
               <w:rPr>
@@ -2849,7 +3229,43 @@
                 <w:sz w:val="22"/>
                 <w:szCs w:val="22"/>
               </w:rPr>
-              <w:t>y se presenta el Menú del sistema</w:t>
+              <w:t xml:space="preserve">” </w:t>
+            </w:r>
+            <w:r>
+              <w:rPr>
+                <w:rFonts w:ascii="Times New Roman" w:eastAsia="Times New Roman" w:hAnsi="Times New Roman" w:cs="Times New Roman"/>
+                <w:color w:val="000000"/>
+                <w:sz w:val="22"/>
+                <w:szCs w:val="22"/>
+              </w:rPr>
+              <w:t>y se presenta el Menú</w:t>
+            </w:r>
+            <w:r>
+              <w:rPr>
+                <w:rFonts w:ascii="Times New Roman" w:eastAsia="Times New Roman" w:hAnsi="Times New Roman" w:cs="Times New Roman"/>
+                <w:color w:val="000000"/>
+                <w:sz w:val="22"/>
+                <w:szCs w:val="22"/>
+              </w:rPr>
+              <w:t xml:space="preserve"> principal</w:t>
+            </w:r>
+            <w:r>
+              <w:rPr>
+                <w:rFonts w:ascii="Times New Roman" w:eastAsia="Times New Roman" w:hAnsi="Times New Roman" w:cs="Times New Roman"/>
+                <w:color w:val="000000"/>
+                <w:sz w:val="22"/>
+                <w:szCs w:val="22"/>
+              </w:rPr>
+              <w:t xml:space="preserve"> del sistema</w:t>
+            </w:r>
+            <w:r>
+              <w:rPr>
+                <w:rFonts w:ascii="Times New Roman" w:eastAsia="Times New Roman" w:hAnsi="Times New Roman" w:cs="Times New Roman"/>
+                <w:color w:val="000000"/>
+                <w:sz w:val="22"/>
+                <w:szCs w:val="22"/>
+              </w:rPr>
+              <w:t>.</w:t>
             </w:r>
           </w:p>
         </w:tc>
@@ -2888,7 +3304,6 @@
                 <w:bCs/>
                 <w:color w:val="000000"/>
               </w:rPr>
-              <w:lastRenderedPageBreak/>
               <w:t>FLUJOS ALTERNATIVO: </w:t>
             </w:r>
           </w:p>
@@ -2968,7 +3383,21 @@
                 <w:rFonts w:ascii="Times New Roman" w:eastAsia="Times New Roman" w:hAnsi="Times New Roman" w:cs="Times New Roman"/>
                 <w:color w:val="000000"/>
               </w:rPr>
-              <w:t>Ingrese un correo electrónico valido</w:t>
+              <w:t>Ingrese un correo electrónico v</w:t>
+            </w:r>
+            <w:r>
+              <w:rPr>
+                <w:rFonts w:ascii="Times New Roman" w:eastAsia="Times New Roman" w:hAnsi="Times New Roman" w:cs="Times New Roman"/>
+                <w:color w:val="000000"/>
+              </w:rPr>
+              <w:t>á</w:t>
+            </w:r>
+            <w:r>
+              <w:rPr>
+                <w:rFonts w:ascii="Times New Roman" w:eastAsia="Times New Roman" w:hAnsi="Times New Roman" w:cs="Times New Roman"/>
+                <w:color w:val="000000"/>
+              </w:rPr>
+              <w:t>lido</w:t>
             </w:r>
             <w:r>
               <w:rPr>
@@ -3031,61 +3460,11 @@
               </w:rPr>
               <w:t xml:space="preserve"> El sistema muestra en pantalla un mensaje de error: “Ingrese una contraseña”</w:t>
             </w:r>
-          </w:p>
-          <w:p>
-            <w:pPr>
-              <w:spacing w:after="0" w:line="240" w:lineRule="auto"/>
-              <w:rPr>
-                <w:rFonts w:ascii="Times New Roman" w:eastAsia="Times New Roman" w:hAnsi="Times New Roman" w:cs="Times New Roman"/>
-                <w:b/>
-                <w:bCs/>
-              </w:rPr>
-            </w:pPr>
-            <w:r>
-              <w:rPr>
-                <w:rFonts w:ascii="Times New Roman" w:eastAsia="Times New Roman" w:hAnsi="Times New Roman" w:cs="Times New Roman"/>
-                <w:b/>
-                <w:bCs/>
-              </w:rPr>
-              <w:t>FA3 – Usuario No encontrado</w:t>
-            </w:r>
-          </w:p>
-          <w:p>
-            <w:pPr>
-              <w:spacing w:after="0" w:line="240" w:lineRule="auto"/>
-              <w:rPr>
-                <w:rFonts w:ascii="Times New Roman" w:eastAsia="Times New Roman" w:hAnsi="Times New Roman" w:cs="Times New Roman"/>
-              </w:rPr>
-            </w:pPr>
-            <w:r>
-              <w:rPr>
-                <w:rFonts w:ascii="Times New Roman" w:eastAsia="Times New Roman" w:hAnsi="Times New Roman" w:cs="Times New Roman"/>
-                <w:b/>
-                <w:bCs/>
-              </w:rPr>
-              <w:t>6</w:t>
-            </w:r>
-            <w:r>
-              <w:rPr>
-                <w:rFonts w:ascii="Times New Roman" w:eastAsia="Times New Roman" w:hAnsi="Times New Roman" w:cs="Times New Roman"/>
-                <w:b/>
-                <w:bCs/>
-              </w:rPr>
-              <w:t>.</w:t>
-            </w:r>
-            <w:r>
-              <w:rPr>
-                <w:rFonts w:ascii="Times New Roman" w:eastAsia="Times New Roman" w:hAnsi="Times New Roman" w:cs="Times New Roman"/>
-                <w:b/>
-                <w:bCs/>
-              </w:rPr>
-              <w:t>1</w:t>
-            </w:r>
-            <w:r>
-              <w:rPr>
-                <w:rFonts w:ascii="Times New Roman" w:eastAsia="Times New Roman" w:hAnsi="Times New Roman" w:cs="Times New Roman"/>
-              </w:rPr>
-              <w:t xml:space="preserve"> El sistema muestra en pantalla un mensaje de error: “No existe el usuario ingresado” </w:t>
+            <w:r>
+              <w:rPr>
+                <w:rFonts w:ascii="Times New Roman" w:eastAsia="Times New Roman" w:hAnsi="Times New Roman" w:cs="Times New Roman"/>
+              </w:rPr>
+              <w:t xml:space="preserve"> </w:t>
             </w:r>
           </w:p>
         </w:tc>
@@ -3137,7 +3516,6 @@
         </w:tc>
       </w:tr>
     </w:tbl>
-    <w:p/>
     <w:p>
       <w:pPr>
         <w:pStyle w:val="Ttulo3"/>
@@ -3149,6 +3527,7 @@
         <w:rPr>
           <w:rFonts w:ascii="Times New Roman" w:eastAsia="Times New Roman" w:hAnsi="Times New Roman" w:cs="Times New Roman"/>
         </w:rPr>
+        <w:lastRenderedPageBreak/>
         <w:t>2.3.</w:t>
       </w:r>
       <w:r>
@@ -3165,93 +3544,15 @@
       </w:r>
     </w:p>
     <w:p>
-      <w:pPr>
-        <w:pStyle w:val="Ttulo3"/>
-        <w:rPr>
-          <w:rFonts w:ascii="Times New Roman" w:eastAsia="Times New Roman" w:hAnsi="Times New Roman" w:cs="Times New Roman"/>
-        </w:rPr>
-      </w:pPr>
-      <w:r>
-        <w:rPr>
-          <w:rFonts w:ascii="Times New Roman" w:eastAsia="Times New Roman" w:hAnsi="Times New Roman" w:cs="Times New Roman"/>
-        </w:rPr>
-        <w:t>2.3.</w:t>
-      </w:r>
-      <w:r>
-        <w:rPr>
-          <w:rFonts w:ascii="Times New Roman" w:eastAsia="Times New Roman" w:hAnsi="Times New Roman" w:cs="Times New Roman"/>
-        </w:rPr>
-        <w:t>4</w:t>
-      </w:r>
-      <w:r>
-        <w:rPr>
-          <w:rFonts w:ascii="Times New Roman" w:eastAsia="Times New Roman" w:hAnsi="Times New Roman" w:cs="Times New Roman"/>
-        </w:rPr>
-        <w:t xml:space="preserve"> Diagrama de Clases</w:t>
-      </w:r>
-    </w:p>
-    <w:p>
-      <w:pPr>
-        <w:pStyle w:val="Ttulo3"/>
-        <w:rPr>
-          <w:rFonts w:ascii="Times New Roman" w:eastAsia="Times New Roman" w:hAnsi="Times New Roman" w:cs="Times New Roman"/>
-        </w:rPr>
-      </w:pPr>
-      <w:r>
-        <w:rPr>
-          <w:rFonts w:ascii="Times New Roman" w:eastAsia="Times New Roman" w:hAnsi="Times New Roman" w:cs="Times New Roman"/>
-        </w:rPr>
-        <w:t>2.3.</w:t>
-      </w:r>
-      <w:r>
-        <w:rPr>
-          <w:rFonts w:ascii="Times New Roman" w:eastAsia="Times New Roman" w:hAnsi="Times New Roman" w:cs="Times New Roman"/>
-        </w:rPr>
-        <w:t>5</w:t>
-      </w:r>
-      <w:r>
-        <w:rPr>
-          <w:rFonts w:ascii="Times New Roman" w:eastAsia="Times New Roman" w:hAnsi="Times New Roman" w:cs="Times New Roman"/>
-        </w:rPr>
-        <w:t xml:space="preserve"> Der</w:t>
-      </w:r>
-    </w:p>
-    <w:p>
-      <w:pPr>
-        <w:pStyle w:val="Ttulo3"/>
-        <w:rPr>
-          <w:rFonts w:ascii="Times New Roman" w:eastAsia="Times New Roman" w:hAnsi="Times New Roman" w:cs="Times New Roman"/>
-        </w:rPr>
-      </w:pPr>
-      <w:r>
-        <w:rPr>
-          <w:rFonts w:ascii="Times New Roman" w:eastAsia="Times New Roman" w:hAnsi="Times New Roman" w:cs="Times New Roman"/>
-        </w:rPr>
-        <w:t>2.3.</w:t>
-      </w:r>
-      <w:r>
-        <w:rPr>
-          <w:rFonts w:ascii="Times New Roman" w:eastAsia="Times New Roman" w:hAnsi="Times New Roman" w:cs="Times New Roman"/>
-        </w:rPr>
-        <w:t>6</w:t>
-      </w:r>
-      <w:r>
-        <w:rPr>
-          <w:rFonts w:ascii="Times New Roman" w:eastAsia="Times New Roman" w:hAnsi="Times New Roman" w:cs="Times New Roman"/>
-        </w:rPr>
-        <w:t xml:space="preserve"> Pantalla GIU</w:t>
-      </w:r>
-    </w:p>
-    <w:p>
       <w:r>
         <w:rPr>
           <w:noProof/>
         </w:rPr>
         <w:drawing>
-          <wp:inline distT="0" distB="0" distL="0" distR="0" wp14:anchorId="4CFE5F68" wp14:editId="5EAFF726">
-            <wp:extent cx="4015740" cy="2623642"/>
-            <wp:effectExtent l="0" t="0" r="3810" b="5715"/>
-            <wp:docPr id="544181637" name="Imagen 1"/>
+          <wp:inline distT="0" distB="0" distL="0" distR="0" wp14:anchorId="4D63AA36" wp14:editId="194D3FD7">
+            <wp:extent cx="6112101" cy="5341620"/>
+            <wp:effectExtent l="0" t="0" r="3175" b="0"/>
+            <wp:docPr id="913282966" name="Imagen 1"/>
             <wp:cNvGraphicFramePr>
               <a:graphicFrameLocks xmlns:a="http://schemas.openxmlformats.org/drawingml/2006/main" noChangeAspect="1"/>
             </wp:cNvGraphicFramePr>
@@ -3259,11 +3560,142 @@
               <a:graphicData uri="http://schemas.openxmlformats.org/drawingml/2006/picture">
                 <pic:pic xmlns:pic="http://schemas.openxmlformats.org/drawingml/2006/picture">
                   <pic:nvPicPr>
-                    <pic:cNvPr id="544181637" name=""/>
+                    <pic:cNvPr id="0" name="Picture 1"/>
+                    <pic:cNvPicPr>
+                      <a:picLocks noChangeAspect="1" noChangeArrowheads="1"/>
+                    </pic:cNvPicPr>
+                  </pic:nvPicPr>
+                  <pic:blipFill>
+                    <a:blip r:embed="rId18">
+                      <a:extLst>
+                        <a:ext uri="{28A0092B-C50C-407E-A947-70E740481C1C}">
+                          <a14:useLocalDpi xmlns:a14="http://schemas.microsoft.com/office/drawing/2010/main" val="0"/>
+                        </a:ext>
+                      </a:extLst>
+                    </a:blip>
+                    <a:srcRect/>
+                    <a:stretch>
+                      <a:fillRect/>
+                    </a:stretch>
+                  </pic:blipFill>
+                  <pic:spPr bwMode="auto">
+                    <a:xfrm>
+                      <a:off x="0" y="0"/>
+                      <a:ext cx="6117174" cy="5346054"/>
+                    </a:xfrm>
+                    <a:prstGeom prst="rect">
+                      <a:avLst/>
+                    </a:prstGeom>
+                    <a:noFill/>
+                    <a:ln>
+                      <a:noFill/>
+                    </a:ln>
+                  </pic:spPr>
+                </pic:pic>
+              </a:graphicData>
+            </a:graphic>
+          </wp:inline>
+        </w:drawing>
+      </w:r>
+    </w:p>
+    <w:p>
+      <w:pPr>
+        <w:pStyle w:val="Ttulo3"/>
+        <w:rPr>
+          <w:rFonts w:ascii="Times New Roman" w:eastAsia="Times New Roman" w:hAnsi="Times New Roman" w:cs="Times New Roman"/>
+        </w:rPr>
+      </w:pPr>
+      <w:r>
+        <w:rPr>
+          <w:rFonts w:ascii="Times New Roman" w:eastAsia="Times New Roman" w:hAnsi="Times New Roman" w:cs="Times New Roman"/>
+        </w:rPr>
+        <w:lastRenderedPageBreak/>
+        <w:t>2.3.</w:t>
+      </w:r>
+      <w:r>
+        <w:rPr>
+          <w:rFonts w:ascii="Times New Roman" w:eastAsia="Times New Roman" w:hAnsi="Times New Roman" w:cs="Times New Roman"/>
+        </w:rPr>
+        <w:t>4</w:t>
+      </w:r>
+      <w:r>
+        <w:rPr>
+          <w:rFonts w:ascii="Times New Roman" w:eastAsia="Times New Roman" w:hAnsi="Times New Roman" w:cs="Times New Roman"/>
+        </w:rPr>
+        <w:t xml:space="preserve"> Diagrama de Clases</w:t>
+      </w:r>
+    </w:p>
+    <w:p>
+      <w:pPr>
+        <w:pStyle w:val="Ttulo3"/>
+        <w:rPr>
+          <w:rFonts w:ascii="Times New Roman" w:eastAsia="Times New Roman" w:hAnsi="Times New Roman" w:cs="Times New Roman"/>
+        </w:rPr>
+      </w:pPr>
+      <w:r>
+        <w:rPr>
+          <w:rFonts w:ascii="Times New Roman" w:eastAsia="Times New Roman" w:hAnsi="Times New Roman" w:cs="Times New Roman"/>
+        </w:rPr>
+        <w:t>2.3.</w:t>
+      </w:r>
+      <w:r>
+        <w:rPr>
+          <w:rFonts w:ascii="Times New Roman" w:eastAsia="Times New Roman" w:hAnsi="Times New Roman" w:cs="Times New Roman"/>
+        </w:rPr>
+        <w:t>5</w:t>
+      </w:r>
+      <w:r>
+        <w:rPr>
+          <w:rFonts w:ascii="Times New Roman" w:eastAsia="Times New Roman" w:hAnsi="Times New Roman" w:cs="Times New Roman"/>
+        </w:rPr>
+        <w:t xml:space="preserve"> Der</w:t>
+      </w:r>
+    </w:p>
+    <w:p>
+      <w:pPr>
+        <w:pStyle w:val="Ttulo3"/>
+        <w:rPr>
+          <w:rFonts w:ascii="Times New Roman" w:eastAsia="Times New Roman" w:hAnsi="Times New Roman" w:cs="Times New Roman"/>
+        </w:rPr>
+      </w:pPr>
+      <w:r>
+        <w:rPr>
+          <w:rFonts w:ascii="Times New Roman" w:eastAsia="Times New Roman" w:hAnsi="Times New Roman" w:cs="Times New Roman"/>
+        </w:rPr>
+        <w:t>2.3.</w:t>
+      </w:r>
+      <w:r>
+        <w:rPr>
+          <w:rFonts w:ascii="Times New Roman" w:eastAsia="Times New Roman" w:hAnsi="Times New Roman" w:cs="Times New Roman"/>
+        </w:rPr>
+        <w:t>6</w:t>
+      </w:r>
+      <w:r>
+        <w:rPr>
+          <w:rFonts w:ascii="Times New Roman" w:eastAsia="Times New Roman" w:hAnsi="Times New Roman" w:cs="Times New Roman"/>
+        </w:rPr>
+        <w:t xml:space="preserve"> Pantalla GIU</w:t>
+      </w:r>
+    </w:p>
+    <w:p>
+      <w:r>
+        <w:drawing>
+          <wp:inline distT="0" distB="0" distL="0" distR="0" wp14:anchorId="4320E766" wp14:editId="73CD3AB2">
+            <wp:extent cx="3525520" cy="2263148"/>
+            <wp:effectExtent l="0" t="0" r="0" b="3810"/>
+            <wp:docPr id="1860607311" name="Imagen 1"/>
+            <wp:cNvGraphicFramePr>
+              <a:graphicFrameLocks xmlns:a="http://schemas.openxmlformats.org/drawingml/2006/main" noChangeAspect="1"/>
+            </wp:cNvGraphicFramePr>
+            <a:graphic xmlns:a="http://schemas.openxmlformats.org/drawingml/2006/main">
+              <a:graphicData uri="http://schemas.openxmlformats.org/drawingml/2006/picture">
+                <pic:pic xmlns:pic="http://schemas.openxmlformats.org/drawingml/2006/picture">
+                  <pic:nvPicPr>
+                    <pic:cNvPr id="1860607311" name=""/>
                     <pic:cNvPicPr/>
                   </pic:nvPicPr>
                   <pic:blipFill>
-                    <a:blip r:embed="rId15"/>
+                    <a:blip r:embed="rId19"/>
                     <a:stretch>
                       <a:fillRect/>
                     </a:stretch>
@@ -3271,7 +3703,7 @@
                   <pic:spPr>
                     <a:xfrm>
                       <a:off x="0" y="0"/>
-                      <a:ext cx="4020922" cy="2627028"/>
+                      <a:ext cx="3536235" cy="2270026"/>
                     </a:xfrm>
                     <a:prstGeom prst="rect">
                       <a:avLst/>
@@ -3300,7 +3732,6 @@
           <w:sz w:val="30"/>
           <w:szCs w:val="30"/>
         </w:rPr>
-        <w:lastRenderedPageBreak/>
         <w:t>2.4 LogOut – CU002 LogOut</w:t>
       </w:r>
     </w:p>
@@ -3353,7 +3784,7 @@
                     </pic:cNvPicPr>
                   </pic:nvPicPr>
                   <pic:blipFill>
-                    <a:blip r:embed="rId16">
+                    <a:blip r:embed="rId20">
                       <a:extLst>
                         <a:ext uri="{28A0092B-C50C-407E-A947-70E740481C1C}">
                           <a14:useLocalDpi xmlns:a14="http://schemas.microsoft.com/office/drawing/2010/main" val="0"/>
@@ -3711,6 +4142,7 @@
                 <w:bCs/>
                 <w:color w:val="000000"/>
               </w:rPr>
+              <w:lastRenderedPageBreak/>
               <w:t xml:space="preserve">PRECONDICIONES: </w:t>
             </w:r>
             <w:r>
@@ -3817,7 +4249,7 @@
       </w:tr>
       <w:tr>
         <w:trPr>
-          <w:trHeight w:val="1759"/>
+          <w:trHeight w:val="1398"/>
         </w:trPr>
         <w:tc>
           <w:tcPr>
@@ -3915,7 +4347,34 @@
                 <w:sz w:val="22"/>
                 <w:szCs w:val="22"/>
               </w:rPr>
-              <w:t>El sistema consulta al usuario si confirma cerrar sesión.</w:t>
+              <w:t xml:space="preserve">El sistema consulta al usuario </w:t>
+            </w:r>
+            <w:r>
+              <w:rPr>
+                <w:rFonts w:ascii="Times New Roman" w:eastAsia="Times New Roman" w:hAnsi="Times New Roman" w:cs="Times New Roman"/>
+                <w:color w:val="000000"/>
+                <w:sz w:val="22"/>
+                <w:szCs w:val="22"/>
+              </w:rPr>
+              <w:t>con un mensaje en pantalla “</w:t>
+            </w:r>
+            <w:r>
+              <w:rPr>
+                <w:rFonts w:ascii="Times New Roman" w:eastAsia="Times New Roman" w:hAnsi="Times New Roman" w:cs="Times New Roman"/>
+                <w:color w:val="000000"/>
+                <w:sz w:val="22"/>
+                <w:szCs w:val="22"/>
+              </w:rPr>
+              <w:t>¿Desea cerrar la sesión?</w:t>
+            </w:r>
+            <w:r>
+              <w:rPr>
+                <w:rFonts w:ascii="Times New Roman" w:eastAsia="Times New Roman" w:hAnsi="Times New Roman" w:cs="Times New Roman"/>
+                <w:color w:val="000000"/>
+                <w:sz w:val="22"/>
+                <w:szCs w:val="22"/>
+              </w:rPr>
+              <w:t xml:space="preserve">” </w:t>
             </w:r>
           </w:p>
           <w:p>
@@ -3963,18 +4422,16 @@
                 <w:sz w:val="22"/>
                 <w:szCs w:val="22"/>
               </w:rPr>
-              <w:t>El sistema informa al usuario mediante mensaje en pantalla “Cierre de sesión exitoso”.</w:t>
-            </w:r>
-            <w:r>
-              <w:rPr>
-                <w:rFonts w:ascii="Times New Roman" w:eastAsia="Times New Roman" w:hAnsi="Times New Roman" w:cs="Times New Roman"/>
-                <w:b/>
-                <w:bCs/>
+              <w:t xml:space="preserve">El sistema </w:t>
+            </w:r>
+            <w:r>
+              <w:rPr>
+                <w:rFonts w:ascii="Times New Roman" w:eastAsia="Times New Roman" w:hAnsi="Times New Roman" w:cs="Times New Roman"/>
                 <w:color w:val="000000"/>
                 <w:sz w:val="22"/>
                 <w:szCs w:val="22"/>
               </w:rPr>
-              <w:t xml:space="preserve"> </w:t>
+              <w:t>cierra la sesión del usuario.</w:t>
             </w:r>
           </w:p>
         </w:tc>
@@ -4114,7 +4571,21 @@
                 <w:rFonts w:ascii="Times New Roman" w:eastAsia="Times New Roman" w:hAnsi="Times New Roman" w:cs="Times New Roman"/>
                 <w:color w:val="000000"/>
               </w:rPr>
-              <w:t>El usuario cierra su sesión y vuelve a la interfaz de LogIn.</w:t>
+              <w:t>El usuario cierra su sesión y</w:t>
+            </w:r>
+            <w:r>
+              <w:rPr>
+                <w:rFonts w:ascii="Times New Roman" w:eastAsia="Times New Roman" w:hAnsi="Times New Roman" w:cs="Times New Roman"/>
+                <w:color w:val="000000"/>
+              </w:rPr>
+              <w:t xml:space="preserve"> cierra el programa</w:t>
+            </w:r>
+            <w:r>
+              <w:rPr>
+                <w:rFonts w:ascii="Times New Roman" w:eastAsia="Times New Roman" w:hAnsi="Times New Roman" w:cs="Times New Roman"/>
+                <w:color w:val="000000"/>
+              </w:rPr>
+              <w:t>.</w:t>
             </w:r>
           </w:p>
         </w:tc>
@@ -4132,7 +4603,6 @@
         <w:rPr>
           <w:rFonts w:ascii="Times New Roman" w:eastAsia="Times New Roman" w:hAnsi="Times New Roman" w:cs="Times New Roman"/>
         </w:rPr>
-        <w:lastRenderedPageBreak/>
         <w:t>2.4.</w:t>
       </w:r>
       <w:r>
@@ -4154,10 +4624,10 @@
           <w:noProof/>
         </w:rPr>
         <w:drawing>
-          <wp:inline distT="0" distB="0" distL="0" distR="0" wp14:anchorId="22D3FEB1" wp14:editId="020222EE">
-            <wp:extent cx="4102100" cy="2875811"/>
-            <wp:effectExtent l="0" t="0" r="0" b="1270"/>
-            <wp:docPr id="1376958252" name="Imagen 1"/>
+          <wp:inline distT="0" distB="0" distL="0" distR="0" wp14:anchorId="574F801F" wp14:editId="7C52FE30">
+            <wp:extent cx="4907280" cy="3368040"/>
+            <wp:effectExtent l="0" t="0" r="7620" b="3810"/>
+            <wp:docPr id="534759127" name="Imagen 6"/>
             <wp:cNvGraphicFramePr>
               <a:graphicFrameLocks xmlns:a="http://schemas.openxmlformats.org/drawingml/2006/main" noChangeAspect="1"/>
             </wp:cNvGraphicFramePr>
@@ -4165,13 +4635,13 @@
               <a:graphicData uri="http://schemas.openxmlformats.org/drawingml/2006/picture">
                 <pic:pic xmlns:pic="http://schemas.openxmlformats.org/drawingml/2006/picture">
                   <pic:nvPicPr>
-                    <pic:cNvPr id="0" name="Picture 1"/>
+                    <pic:cNvPr id="0" name="Picture 6"/>
                     <pic:cNvPicPr>
                       <a:picLocks noChangeAspect="1" noChangeArrowheads="1"/>
                     </pic:cNvPicPr>
                   </pic:nvPicPr>
                   <pic:blipFill>
-                    <a:blip r:embed="rId17">
+                    <a:blip r:embed="rId21">
                       <a:extLst>
                         <a:ext uri="{28A0092B-C50C-407E-A947-70E740481C1C}">
                           <a14:useLocalDpi xmlns:a14="http://schemas.microsoft.com/office/drawing/2010/main" val="0"/>
@@ -4186,7 +4656,7 @@
                   <pic:spPr bwMode="auto">
                     <a:xfrm>
                       <a:off x="0" y="0"/>
-                      <a:ext cx="4107954" cy="2879915"/>
+                      <a:ext cx="4907280" cy="3368040"/>
                     </a:xfrm>
                     <a:prstGeom prst="rect">
                       <a:avLst/>
@@ -4307,14 +4777,13 @@
           <w:rFonts w:ascii="Times New Roman" w:eastAsia="Times New Roman" w:hAnsi="Times New Roman" w:cs="Times New Roman"/>
           <w:b/>
           <w:bCs/>
-          <w:noProof/>
           <w:color w:val="000000"/>
         </w:rPr>
         <w:drawing>
-          <wp:inline distT="0" distB="0" distL="0" distR="0" wp14:anchorId="6E942C35" wp14:editId="7926AEE6">
-            <wp:extent cx="5400040" cy="3612515"/>
-            <wp:effectExtent l="0" t="0" r="0" b="6985"/>
-            <wp:docPr id="233715198" name="Imagen 1"/>
+          <wp:inline distT="0" distB="0" distL="0" distR="0" wp14:anchorId="08DE1210" wp14:editId="4E58B335">
+            <wp:extent cx="5400040" cy="3225800"/>
+            <wp:effectExtent l="0" t="0" r="0" b="0"/>
+            <wp:docPr id="239392437" name="Imagen 1"/>
             <wp:cNvGraphicFramePr>
               <a:graphicFrameLocks xmlns:a="http://schemas.openxmlformats.org/drawingml/2006/main" noChangeAspect="1"/>
             </wp:cNvGraphicFramePr>
@@ -4322,11 +4791,11 @@
               <a:graphicData uri="http://schemas.openxmlformats.org/drawingml/2006/picture">
                 <pic:pic xmlns:pic="http://schemas.openxmlformats.org/drawingml/2006/picture">
                   <pic:nvPicPr>
-                    <pic:cNvPr id="233715198" name=""/>
+                    <pic:cNvPr id="239392437" name=""/>
                     <pic:cNvPicPr/>
                   </pic:nvPicPr>
                   <pic:blipFill>
-                    <a:blip r:embed="rId18"/>
+                    <a:blip r:embed="rId22"/>
                     <a:stretch>
                       <a:fillRect/>
                     </a:stretch>
@@ -4334,7 +4803,7 @@
                   <pic:spPr>
                     <a:xfrm>
                       <a:off x="0" y="0"/>
-                      <a:ext cx="5400040" cy="3612515"/>
+                      <a:ext cx="5400040" cy="3225800"/>
                     </a:xfrm>
                     <a:prstGeom prst="rect">
                       <a:avLst/>
@@ -4346,18 +4815,6 @@
           </wp:inline>
         </w:drawing>
       </w:r>
-    </w:p>
-    <w:p>
-      <w:pPr>
-        <w:spacing w:after="239" w:line="257" w:lineRule="auto"/>
-        <w:ind w:right="76"/>
-        <w:jc w:val="both"/>
-        <w:rPr>
-          <w:rFonts w:ascii="Times New Roman" w:eastAsia="Times New Roman" w:hAnsi="Times New Roman" w:cs="Times New Roman"/>
-          <w:b/>
-          <w:bCs/>
-        </w:rPr>
-      </w:pPr>
     </w:p>
     <w:p>
       <w:pPr>
@@ -4460,7 +4917,7 @@
                     </pic:cNvPicPr>
                   </pic:nvPicPr>
                   <pic:blipFill>
-                    <a:blip r:embed="rId19">
+                    <a:blip r:embed="rId23">
                       <a:extLst>
                         <a:ext uri="{28A0092B-C50C-407E-A947-70E740481C1C}">
                           <a14:useLocalDpi xmlns:a14="http://schemas.microsoft.com/office/drawing/2010/main" val="0"/>
@@ -4531,7 +4988,7 @@
                     <pic:cNvPicPr/>
                   </pic:nvPicPr>
                   <pic:blipFill>
-                    <a:blip r:embed="rId20"/>
+                    <a:blip r:embed="rId24"/>
                     <a:stretch>
                       <a:fillRect/>
                     </a:stretch>
@@ -5451,10 +5908,10 @@
           <w:noProof/>
         </w:rPr>
         <w:drawing>
-          <wp:inline distT="0" distB="0" distL="0" distR="0" wp14:anchorId="2466FE92" wp14:editId="05B62775">
-            <wp:extent cx="6102350" cy="3449435"/>
-            <wp:effectExtent l="0" t="0" r="0" b="0"/>
-            <wp:docPr id="911305908" name="Imagen 2"/>
+          <wp:inline distT="0" distB="0" distL="0" distR="0" wp14:anchorId="32047613" wp14:editId="14C74452">
+            <wp:extent cx="6210300" cy="3901885"/>
+            <wp:effectExtent l="0" t="0" r="0" b="3810"/>
+            <wp:docPr id="1086218720" name="Imagen 5"/>
             <wp:cNvGraphicFramePr>
               <a:graphicFrameLocks xmlns:a="http://schemas.openxmlformats.org/drawingml/2006/main" noChangeAspect="1"/>
             </wp:cNvGraphicFramePr>
@@ -5462,13 +5919,13 @@
               <a:graphicData uri="http://schemas.openxmlformats.org/drawingml/2006/picture">
                 <pic:pic xmlns:pic="http://schemas.openxmlformats.org/drawingml/2006/picture">
                   <pic:nvPicPr>
-                    <pic:cNvPr id="0" name="Picture 2"/>
+                    <pic:cNvPr id="0" name="Picture 5"/>
                     <pic:cNvPicPr>
                       <a:picLocks noChangeAspect="1" noChangeArrowheads="1"/>
                     </pic:cNvPicPr>
                   </pic:nvPicPr>
                   <pic:blipFill>
-                    <a:blip r:embed="rId21">
+                    <a:blip r:embed="rId25">
                       <a:extLst>
                         <a:ext uri="{28A0092B-C50C-407E-A947-70E740481C1C}">
                           <a14:useLocalDpi xmlns:a14="http://schemas.microsoft.com/office/drawing/2010/main" val="0"/>
@@ -5483,7 +5940,7 @@
                   <pic:spPr bwMode="auto">
                     <a:xfrm>
                       <a:off x="0" y="0"/>
-                      <a:ext cx="6105520" cy="3451227"/>
+                      <a:ext cx="6212536" cy="3903290"/>
                     </a:xfrm>
                     <a:prstGeom prst="rect">
                       <a:avLst/>
@@ -5499,16 +5956,6 @@
           </wp:inline>
         </w:drawing>
       </w:r>
-      <w:r>
-        <w:tab/>
-      </w:r>
-    </w:p>
-    <w:p>
-      <w:pPr>
-        <w:tabs>
-          <w:tab w:val="left" w:pos="1752"/>
-        </w:tabs>
-      </w:pPr>
     </w:p>
     <w:p>
       <w:pPr>
@@ -5954,7 +6401,6 @@
                 <w:bCs/>
                 <w:color w:val="000000"/>
               </w:rPr>
-              <w:lastRenderedPageBreak/>
               <w:t>CONDICIÓN:</w:t>
             </w:r>
           </w:p>
@@ -5994,6 +6440,7 @@
                 <w:bCs/>
                 <w:color w:val="000000"/>
               </w:rPr>
+              <w:lastRenderedPageBreak/>
               <w:t>ESCENARIO PRINCIPAL: </w:t>
             </w:r>
           </w:p>
@@ -6333,13 +6780,6 @@
         </w:rPr>
         <w:t xml:space="preserve"> Diagrama Secuencia Sistema </w:t>
       </w:r>
-    </w:p>
-    <w:p>
-      <w:pPr>
-        <w:rPr>
-          <w:rFonts w:ascii="Times New Roman" w:eastAsia="Times New Roman" w:hAnsi="Times New Roman" w:cs="Times New Roman"/>
-        </w:rPr>
-      </w:pPr>
     </w:p>
     <w:p>
       <w:pPr>
@@ -7399,7 +7839,7 @@
                     </pic:cNvPicPr>
                   </pic:nvPicPr>
                   <pic:blipFill>
-                    <a:blip r:embed="rId22">
+                    <a:blip r:embed="rId26">
                       <a:extLst>
                         <a:ext uri="{28A0092B-C50C-407E-A947-70E740481C1C}">
                           <a14:useLocalDpi xmlns:a14="http://schemas.microsoft.com/office/drawing/2010/main" val="0"/>
@@ -7470,7 +7910,7 @@
                     <pic:cNvPicPr/>
                   </pic:nvPicPr>
                   <pic:blipFill>
-                    <a:blip r:embed="rId23"/>
+                    <a:blip r:embed="rId27"/>
                     <a:stretch>
                       <a:fillRect/>
                     </a:stretch>
@@ -8311,40 +8751,33 @@
         </w:tc>
       </w:tr>
     </w:tbl>
+    <w:p>
+      <w:pPr>
+        <w:pStyle w:val="Ttulo3"/>
+        <w:rPr>
+          <w:rFonts w:ascii="Times New Roman" w:eastAsia="Times New Roman" w:hAnsi="Times New Roman" w:cs="Times New Roman"/>
+        </w:rPr>
+      </w:pPr>
+      <w:r>
+        <w:rPr>
+          <w:rFonts w:ascii="Times New Roman" w:eastAsia="Times New Roman" w:hAnsi="Times New Roman" w:cs="Times New Roman"/>
+        </w:rPr>
+        <w:t>4.5.</w:t>
+      </w:r>
+      <w:r>
+        <w:rPr>
+          <w:rFonts w:ascii="Times New Roman" w:eastAsia="Times New Roman" w:hAnsi="Times New Roman" w:cs="Times New Roman"/>
+        </w:rPr>
+        <w:t>2</w:t>
+      </w:r>
+      <w:r>
+        <w:rPr>
+          <w:rFonts w:ascii="Times New Roman" w:eastAsia="Times New Roman" w:hAnsi="Times New Roman" w:cs="Times New Roman"/>
+        </w:rPr>
+        <w:t xml:space="preserve"> Diagrama Secuencia Sistema </w:t>
+      </w:r>
+    </w:p>
     <w:p/>
-    <w:p>
-      <w:pPr>
-        <w:pStyle w:val="Ttulo3"/>
-        <w:rPr>
-          <w:rFonts w:ascii="Times New Roman" w:eastAsia="Times New Roman" w:hAnsi="Times New Roman" w:cs="Times New Roman"/>
-        </w:rPr>
-      </w:pPr>
-      <w:r>
-        <w:rPr>
-          <w:rFonts w:ascii="Times New Roman" w:eastAsia="Times New Roman" w:hAnsi="Times New Roman" w:cs="Times New Roman"/>
-        </w:rPr>
-        <w:t>4.5.</w:t>
-      </w:r>
-      <w:r>
-        <w:rPr>
-          <w:rFonts w:ascii="Times New Roman" w:eastAsia="Times New Roman" w:hAnsi="Times New Roman" w:cs="Times New Roman"/>
-        </w:rPr>
-        <w:t>2</w:t>
-      </w:r>
-      <w:r>
-        <w:rPr>
-          <w:rFonts w:ascii="Times New Roman" w:eastAsia="Times New Roman" w:hAnsi="Times New Roman" w:cs="Times New Roman"/>
-        </w:rPr>
-        <w:t xml:space="preserve"> Diagrama Secuencia Sistema </w:t>
-      </w:r>
-    </w:p>
-    <w:p>
-      <w:pPr>
-        <w:rPr>
-          <w:rFonts w:ascii="Times New Roman" w:eastAsia="Times New Roman" w:hAnsi="Times New Roman" w:cs="Times New Roman"/>
-        </w:rPr>
-      </w:pPr>
-    </w:p>
     <w:p>
       <w:pPr>
         <w:pStyle w:val="Ttulo2"/>
@@ -8496,7 +8929,6 @@
                 <w:bCs/>
                 <w:color w:val="000000"/>
               </w:rPr>
-              <w:lastRenderedPageBreak/>
               <w:t>ESTADO:</w:t>
             </w:r>
             <w:r>
@@ -8543,6 +8975,7 @@
                 <w:bCs/>
                 <w:color w:val="000000"/>
               </w:rPr>
+              <w:lastRenderedPageBreak/>
               <w:t xml:space="preserve">DESCRIPCIÓN: </w:t>
             </w:r>
             <w:r>
@@ -9186,6 +9619,7 @@
         <w:t xml:space="preserve"> Diagrama Secuencia Sistema </w:t>
       </w:r>
     </w:p>
+    <w:p/>
     <w:p>
       <w:pPr>
         <w:pStyle w:val="Ttulo2"/>
@@ -10125,7 +10559,6 @@
         </w:tc>
       </w:tr>
     </w:tbl>
-    <w:p/>
     <w:p>
       <w:pPr>
         <w:pStyle w:val="Ttulo3"/>
@@ -10240,8 +10673,8 @@
       </w:pPr>
     </w:p>
     <w:sectPr>
-      <w:headerReference w:type="default" r:id="rId24"/>
-      <w:footerReference w:type="default" r:id="rId25"/>
+      <w:headerReference w:type="default" r:id="rId28"/>
+      <w:footerReference w:type="default" r:id="rId29"/>
       <w:pgSz w:w="11906" w:h="16838"/>
       <w:pgMar w:top="1417" w:right="1701" w:bottom="1417" w:left="1701" w:header="708" w:footer="708" w:gutter="0"/>
       <w:pgNumType w:start="1"/>
@@ -13061,7 +13494,7 @@
   <w:abstractNum w:abstractNumId="17" w15:restartNumberingAfterBreak="0">
     <w:nsid w:val="62C615B1"/>
     <w:multiLevelType w:val="hybridMultilevel"/>
-    <w:tmpl w:val="9400553A"/>
+    <w:tmpl w:val="69AC4796"/>
     <w:lvl w:ilvl="0" w:tplc="2C0A0001">
       <w:start w:val="1"/>
       <w:numFmt w:val="bullet"/>
@@ -13955,7 +14388,6 @@
   <w:style w:type="character" w:default="1" w:styleId="Fuentedeprrafopredeter">
     <w:name w:val="Default Paragraph Font"/>
     <w:uiPriority w:val="1"/>
-    <w:semiHidden/>
     <w:unhideWhenUsed/>
   </w:style>
   <w:style w:type="table" w:default="1" w:styleId="Tablanormal">

</xml_diff>

<commit_message>
Cambios documentacion y codigo
Se corrigio DSS LogOut, para que se reprensente mejor el flujo alternativo.
Se corrigio codigo del frm de creacion de usuarios para que dejé de mostrar una pantalla de Login luego de crear un usuario.
</commit_message>
<xml_diff>
--- a/Documentación/ProyectoIS 2026 CAJAL-FERNANDEZ.docx
+++ b/Documentación/ProyectoIS 2026 CAJAL-FERNANDEZ.docx
@@ -5783,23 +5783,7 @@
           <w:rFonts w:ascii="Times New Roman" w:eastAsia="Times New Roman" w:hAnsi="Times New Roman" w:cs="Times New Roman"/>
           <w:color w:val="000000"/>
         </w:rPr>
-        <w:t>Registro/</w:t>
-      </w:r>
-      <w:proofErr w:type="spellStart"/>
-      <w:r>
-        <w:rPr>
-          <w:rFonts w:ascii="Times New Roman" w:eastAsia="Times New Roman" w:hAnsi="Times New Roman" w:cs="Times New Roman"/>
-          <w:color w:val="000000"/>
-        </w:rPr>
-        <w:t>LogIn</w:t>
-      </w:r>
-      <w:proofErr w:type="spellEnd"/>
-      <w:r>
-        <w:rPr>
-          <w:rFonts w:ascii="Times New Roman" w:eastAsia="Times New Roman" w:hAnsi="Times New Roman" w:cs="Times New Roman"/>
-          <w:color w:val="000000"/>
-        </w:rPr>
-        <w:t>-Out</w:t>
+        <w:t>Registro/LogIn-Out</w:t>
       </w:r>
       <w:r>
         <w:rPr>
@@ -7547,23 +7531,7 @@
           <w:rFonts w:ascii="Times New Roman" w:eastAsia="Times New Roman" w:hAnsi="Times New Roman" w:cs="Times New Roman"/>
           <w:color w:val="000000"/>
         </w:rPr>
-        <w:t xml:space="preserve"> Al iniciar el sistema, se carga la interfaz de </w:t>
-      </w:r>
-      <w:proofErr w:type="spellStart"/>
-      <w:r>
-        <w:rPr>
-          <w:rFonts w:ascii="Times New Roman" w:eastAsia="Times New Roman" w:hAnsi="Times New Roman" w:cs="Times New Roman"/>
-          <w:color w:val="000000"/>
-        </w:rPr>
-        <w:t>LogIn</w:t>
-      </w:r>
-      <w:proofErr w:type="spellEnd"/>
-      <w:r>
-        <w:rPr>
-          <w:rFonts w:ascii="Times New Roman" w:eastAsia="Times New Roman" w:hAnsi="Times New Roman" w:cs="Times New Roman"/>
-          <w:color w:val="000000"/>
-        </w:rPr>
-        <w:t xml:space="preserve"> y se presenta al usuario como pantalla principal. En esta etapa no hay ninguna sesión activa ni conexión abierta con la base de datos. Por el momento no se realiza ninguna validación de permisos hasta que el usuario intenta autenticarse. Este enfoque busca minimizar el uso de recursos y mantener la seguridad hasta que se confirme la identidad del usuario. </w:t>
+        <w:t xml:space="preserve"> Al iniciar el sistema, se carga la interfaz de LogIn y se presenta al usuario como pantalla principal. En esta etapa no hay ninguna sesión activa ni conexión abierta con la base de datos. Por el momento no se realiza ninguna validación de permisos hasta que el usuario intenta autenticarse. Este enfoque busca minimizar el uso de recursos y mantener la seguridad hasta que se confirme la identidad del usuario. </w:t>
       </w:r>
     </w:p>
     <w:p>
@@ -7811,72 +7779,15 @@
           <w:rFonts w:ascii="Times New Roman" w:eastAsia="Times New Roman" w:hAnsi="Times New Roman" w:cs="Times New Roman"/>
           <w:color w:val="000000"/>
         </w:rPr>
-        <w:t xml:space="preserve">A su vez en la pantalla del </w:t>
-      </w:r>
-      <w:proofErr w:type="spellStart"/>
+        <w:t xml:space="preserve">A su vez en la pantalla del LogIn presentamos un botón “mostrar” para que si el usuario quiere revisar la contraseña ingresada antes de presionar el botón LogIn pueda hacerlo. Para ello debemos setear la propiedad </w:t>
+      </w:r>
       <w:r>
         <w:rPr>
           <w:rFonts w:ascii="Times New Roman" w:eastAsia="Times New Roman" w:hAnsi="Times New Roman" w:cs="Times New Roman"/>
           <w:color w:val="000000"/>
         </w:rPr>
-        <w:t>LogIn</w:t>
-      </w:r>
-      <w:proofErr w:type="spellEnd"/>
-      <w:r>
-        <w:rPr>
-          <w:rFonts w:ascii="Times New Roman" w:eastAsia="Times New Roman" w:hAnsi="Times New Roman" w:cs="Times New Roman"/>
-          <w:color w:val="000000"/>
-        </w:rPr>
-        <w:t xml:space="preserve"> presentamos un botón “mostrar” para que si el usuario quiere revisar la contraseña ingresada antes de presionar el botón </w:t>
-      </w:r>
-      <w:proofErr w:type="spellStart"/>
-      <w:r>
-        <w:rPr>
-          <w:rFonts w:ascii="Times New Roman" w:eastAsia="Times New Roman" w:hAnsi="Times New Roman" w:cs="Times New Roman"/>
-          <w:color w:val="000000"/>
-        </w:rPr>
-        <w:t>LogIn</w:t>
-      </w:r>
-      <w:proofErr w:type="spellEnd"/>
-      <w:r>
-        <w:rPr>
-          <w:rFonts w:ascii="Times New Roman" w:eastAsia="Times New Roman" w:hAnsi="Times New Roman" w:cs="Times New Roman"/>
-          <w:color w:val="000000"/>
-        </w:rPr>
-        <w:t xml:space="preserve"> pueda hacerlo. Para ello debemos </w:t>
-      </w:r>
-      <w:proofErr w:type="spellStart"/>
-      <w:r>
-        <w:rPr>
-          <w:rFonts w:ascii="Times New Roman" w:eastAsia="Times New Roman" w:hAnsi="Times New Roman" w:cs="Times New Roman"/>
-          <w:color w:val="000000"/>
-        </w:rPr>
-        <w:t>setear</w:t>
-      </w:r>
-      <w:proofErr w:type="spellEnd"/>
-      <w:r>
-        <w:rPr>
-          <w:rFonts w:ascii="Times New Roman" w:eastAsia="Times New Roman" w:hAnsi="Times New Roman" w:cs="Times New Roman"/>
-          <w:color w:val="000000"/>
-        </w:rPr>
-        <w:t xml:space="preserve"> la propiedad </w:t>
-      </w:r>
-      <w:proofErr w:type="spellStart"/>
-      <w:r>
-        <w:rPr>
-          <w:rFonts w:ascii="Times New Roman" w:eastAsia="Times New Roman" w:hAnsi="Times New Roman" w:cs="Times New Roman"/>
-          <w:color w:val="000000"/>
-        </w:rPr>
         <w:lastRenderedPageBreak/>
-        <w:t>PasswordChar</w:t>
-      </w:r>
-      <w:proofErr w:type="spellEnd"/>
-      <w:r>
-        <w:rPr>
-          <w:rFonts w:ascii="Times New Roman" w:eastAsia="Times New Roman" w:hAnsi="Times New Roman" w:cs="Times New Roman"/>
-          <w:color w:val="000000"/>
-        </w:rPr>
-        <w:t xml:space="preserve"> del TextBox en donde el usuario ingresa la contraseña como “*” por default.</w:t>
+        <w:t>PasswordChar del TextBox en donde el usuario ingresa la contraseña como “*” por default.</w:t>
       </w:r>
     </w:p>
     <w:p>
@@ -7991,37 +7902,9 @@
           <w:sz w:val="30"/>
           <w:szCs w:val="30"/>
         </w:rPr>
-        <w:t xml:space="preserve">2.3 </w:t>
-      </w:r>
-      <w:proofErr w:type="spellStart"/>
-      <w:r>
-        <w:rPr>
-          <w:rFonts w:ascii="Times New Roman" w:eastAsia="Times New Roman" w:hAnsi="Times New Roman" w:cs="Times New Roman"/>
-          <w:sz w:val="30"/>
-          <w:szCs w:val="30"/>
-        </w:rPr>
-        <w:t>LogIn</w:t>
-      </w:r>
-      <w:proofErr w:type="spellEnd"/>
-      <w:r>
-        <w:rPr>
-          <w:rFonts w:ascii="Times New Roman" w:eastAsia="Times New Roman" w:hAnsi="Times New Roman" w:cs="Times New Roman"/>
-          <w:sz w:val="30"/>
-          <w:szCs w:val="30"/>
-        </w:rPr>
-        <w:t xml:space="preserve"> – CU001 </w:t>
-      </w:r>
-      <w:proofErr w:type="spellStart"/>
-      <w:r>
-        <w:rPr>
-          <w:rFonts w:ascii="Times New Roman" w:eastAsia="Times New Roman" w:hAnsi="Times New Roman" w:cs="Times New Roman"/>
-          <w:sz w:val="30"/>
-          <w:szCs w:val="30"/>
-        </w:rPr>
-        <w:t>LogIn</w:t>
+        <w:t>2.3 LogIn – CU001 LogIn</w:t>
       </w:r>
       <w:bookmarkEnd w:id="23"/>
-      <w:proofErr w:type="spellEnd"/>
     </w:p>
     <w:p>
       <w:pPr>
@@ -8047,14 +7930,7 @@
         <w:rPr>
           <w:rFonts w:ascii="Times New Roman" w:eastAsia="Times New Roman" w:hAnsi="Times New Roman" w:cs="Times New Roman"/>
         </w:rPr>
-        <w:t xml:space="preserve"> Diagrama </w:t>
-      </w:r>
-      <w:proofErr w:type="spellStart"/>
-      <w:r>
-        <w:rPr>
-          <w:rFonts w:ascii="Times New Roman" w:eastAsia="Times New Roman" w:hAnsi="Times New Roman" w:cs="Times New Roman"/>
-        </w:rPr>
-        <w:t>LogI</w:t>
+        <w:t xml:space="preserve"> Diagrama LogI</w:t>
       </w:r>
       <w:r>
         <w:rPr>
@@ -8063,7 +7939,6 @@
         <w:t>n</w:t>
       </w:r>
       <w:bookmarkEnd w:id="24"/>
-      <w:proofErr w:type="spellEnd"/>
     </w:p>
     <w:p>
       <w:pPr>
@@ -8206,17 +8081,8 @@
                 <w:rFonts w:ascii="Times New Roman" w:eastAsia="Times New Roman" w:hAnsi="Times New Roman" w:cs="Times New Roman"/>
                 <w:color w:val="000000"/>
               </w:rPr>
-              <w:t xml:space="preserve">CU 001 – </w:t>
-            </w:r>
-            <w:proofErr w:type="spellStart"/>
-            <w:r>
-              <w:rPr>
-                <w:rFonts w:ascii="Times New Roman" w:eastAsia="Times New Roman" w:hAnsi="Times New Roman" w:cs="Times New Roman"/>
-                <w:color w:val="000000"/>
-              </w:rPr>
-              <w:t>LogIn</w:t>
-            </w:r>
-            <w:proofErr w:type="spellEnd"/>
+              <w:t>CU 001 – LogIn</w:t>
+            </w:r>
             <w:r>
               <w:rPr>
                 <w:rFonts w:ascii="Times New Roman" w:eastAsia="Times New Roman" w:hAnsi="Times New Roman" w:cs="Times New Roman"/>
@@ -8632,27 +8498,7 @@
                 <w:sz w:val="22"/>
                 <w:szCs w:val="22"/>
               </w:rPr>
-              <w:t>El usuario ingresa al sistema y se le presenta la pantalla principal del mismo “</w:t>
-            </w:r>
-            <w:proofErr w:type="spellStart"/>
-            <w:r>
-              <w:rPr>
-                <w:rFonts w:ascii="Times New Roman" w:eastAsia="Times New Roman" w:hAnsi="Times New Roman" w:cs="Times New Roman"/>
-                <w:color w:val="000000"/>
-                <w:sz w:val="22"/>
-                <w:szCs w:val="22"/>
-              </w:rPr>
-              <w:t>LogIn</w:t>
-            </w:r>
-            <w:proofErr w:type="spellEnd"/>
-            <w:r>
-              <w:rPr>
-                <w:rFonts w:ascii="Times New Roman" w:eastAsia="Times New Roman" w:hAnsi="Times New Roman" w:cs="Times New Roman"/>
-                <w:color w:val="000000"/>
-                <w:sz w:val="22"/>
-                <w:szCs w:val="22"/>
-              </w:rPr>
-              <w:t>”.</w:t>
+              <w:t>El usuario ingresa al sistema y se le presenta la pantalla principal del mismo “LogIn”.</w:t>
             </w:r>
           </w:p>
           <w:p>
@@ -10572,10 +10418,10 @@
           <w:noProof/>
         </w:rPr>
         <w:drawing>
-          <wp:inline distT="0" distB="0" distL="0" distR="0" wp14:anchorId="595748D0" wp14:editId="6B4729BB">
-            <wp:extent cx="5400040" cy="3974465"/>
-            <wp:effectExtent l="0" t="0" r="0" b="6985"/>
-            <wp:docPr id="1237775139" name="Imagen 3"/>
+          <wp:inline distT="0" distB="0" distL="0" distR="0" wp14:anchorId="225A0E85" wp14:editId="5E994E1B">
+            <wp:extent cx="5400040" cy="4670425"/>
+            <wp:effectExtent l="0" t="0" r="0" b="0"/>
+            <wp:docPr id="182538268" name="Imagen 1"/>
             <wp:cNvGraphicFramePr>
               <a:graphicFrameLocks xmlns:a="http://schemas.openxmlformats.org/drawingml/2006/main" noChangeAspect="1"/>
             </wp:cNvGraphicFramePr>
@@ -10583,7 +10429,7 @@
               <a:graphicData uri="http://schemas.openxmlformats.org/drawingml/2006/picture">
                 <pic:pic xmlns:pic="http://schemas.openxmlformats.org/drawingml/2006/picture">
                   <pic:nvPicPr>
-                    <pic:cNvPr id="0" name="Picture 3"/>
+                    <pic:cNvPr id="0" name="Picture 1"/>
                     <pic:cNvPicPr>
                       <a:picLocks noChangeAspect="1" noChangeArrowheads="1"/>
                     </pic:cNvPicPr>
@@ -10604,7 +10450,7 @@
                   <pic:spPr bwMode="auto">
                     <a:xfrm>
                       <a:off x="0" y="0"/>
-                      <a:ext cx="5400040" cy="3974465"/>
+                      <a:ext cx="5400040" cy="4670425"/>
                     </a:xfrm>
                     <a:prstGeom prst="rect">
                       <a:avLst/>
@@ -11040,6 +10886,7 @@
           <w:sz w:val="30"/>
           <w:szCs w:val="30"/>
         </w:rPr>
+        <w:lastRenderedPageBreak/>
         <w:t xml:space="preserve">3.3 </w:t>
       </w:r>
       <w:r>
@@ -15059,21 +14906,7 @@
         <w:rPr>
           <w:rFonts w:ascii="Times New Roman" w:hAnsi="Times New Roman" w:cs="Times New Roman"/>
         </w:rPr>
-        <w:t xml:space="preserve">Con el objetivo de garantizar la seguridad de las contraseñas de los usuarios, en este proyecto se aplica el algoritmo SHA-256, encargado de transformar una cadena de texto en un valor de longitud determinado, denominado "hash". Este es un algoritmo de </w:t>
-      </w:r>
-      <w:proofErr w:type="spellStart"/>
-      <w:r>
-        <w:rPr>
-          <w:rFonts w:ascii="Times New Roman" w:hAnsi="Times New Roman" w:cs="Times New Roman"/>
-        </w:rPr>
-        <w:t>hashing</w:t>
-      </w:r>
-      <w:proofErr w:type="spellEnd"/>
-      <w:r>
-        <w:rPr>
-          <w:rFonts w:ascii="Times New Roman" w:hAnsi="Times New Roman" w:cs="Times New Roman"/>
-        </w:rPr>
-        <w:t xml:space="preserve"> unidireccional, lo que significa que no es posible desencriptar el hash para obtener la contraseña original. </w:t>
+        <w:t xml:space="preserve">Con el objetivo de garantizar la seguridad de las contraseñas de los usuarios, en este proyecto se aplica el algoritmo SHA-256, encargado de transformar una cadena de texto en un valor de longitud determinado, denominado "hash". Este es un algoritmo de hashing unidireccional, lo que significa que no es posible desencriptar el hash para obtener la contraseña original. </w:t>
       </w:r>
     </w:p>
     <w:p>
@@ -15086,35 +14919,7 @@
         <w:rPr>
           <w:rFonts w:ascii="Times New Roman" w:hAnsi="Times New Roman" w:cs="Times New Roman"/>
         </w:rPr>
-        <w:t xml:space="preserve">Tanto para la creación de usuarios como para el logueo en el sistema de estos mismos, se deberá ingresar una clave. Esta clave será </w:t>
-      </w:r>
-      <w:proofErr w:type="spellStart"/>
-      <w:r>
-        <w:rPr>
-          <w:rFonts w:ascii="Times New Roman" w:hAnsi="Times New Roman" w:cs="Times New Roman"/>
-        </w:rPr>
-        <w:t>hasheada</w:t>
-      </w:r>
-      <w:proofErr w:type="spellEnd"/>
-      <w:r>
-        <w:rPr>
-          <w:rFonts w:ascii="Times New Roman" w:hAnsi="Times New Roman" w:cs="Times New Roman"/>
-        </w:rPr>
-        <w:t xml:space="preserve"> por el algoritmo SHA-256 y será guardada en la base de datos. Un usuario que requiera iniciar sesión deberá ingresar su clave, en la interfaz de Inicio de sesión, el valor que coloque como clave, al seleccionar “Iniciar Sesión” será </w:t>
-      </w:r>
-      <w:proofErr w:type="spellStart"/>
-      <w:r>
-        <w:rPr>
-          <w:rFonts w:ascii="Times New Roman" w:hAnsi="Times New Roman" w:cs="Times New Roman"/>
-        </w:rPr>
-        <w:t>hasheado</w:t>
-      </w:r>
-      <w:proofErr w:type="spellEnd"/>
-      <w:r>
-        <w:rPr>
-          <w:rFonts w:ascii="Times New Roman" w:hAnsi="Times New Roman" w:cs="Times New Roman"/>
-        </w:rPr>
-        <w:t xml:space="preserve"> y comparado con el valor que se encuentre en la base de datos. Si estos valores coinciden, la sesión es iniciada, en el caso contrario donde no coincidan, se mostrará al usuario un error de contraseña incorrecta. </w:t>
+        <w:t xml:space="preserve">Tanto para la creación de usuarios como para el logueo en el sistema de estos mismos, se deberá ingresar una clave. Esta clave será hasheada por el algoritmo SHA-256 y será guardada en la base de datos. Un usuario que requiera iniciar sesión deberá ingresar su clave, en la interfaz de Inicio de sesión, el valor que coloque como clave, al seleccionar “Iniciar Sesión” será hasheado y comparado con el valor que se encuentre en la base de datos. Si estos valores coinciden, la sesión es iniciada, en el caso contrario donde no coincidan, se mostrará al usuario un error de contraseña incorrecta. </w:t>
       </w:r>
     </w:p>
     <w:p>
@@ -15136,25 +14941,7 @@
           <w:b/>
           <w:bCs/>
         </w:rPr>
-        <w:t xml:space="preserve">Método de la clase </w:t>
-      </w:r>
-      <w:proofErr w:type="spellStart"/>
-      <w:r>
-        <w:rPr>
-          <w:rFonts w:ascii="Times New Roman" w:hAnsi="Times New Roman" w:cs="Times New Roman"/>
-          <w:b/>
-          <w:bCs/>
-        </w:rPr>
-        <w:t>Encriptador</w:t>
-      </w:r>
-      <w:proofErr w:type="spellEnd"/>
-      <w:r>
-        <w:rPr>
-          <w:rFonts w:ascii="Times New Roman" w:hAnsi="Times New Roman" w:cs="Times New Roman"/>
-          <w:b/>
-          <w:bCs/>
-        </w:rPr>
-        <w:t xml:space="preserve">: </w:t>
+        <w:t xml:space="preserve">Método de la clase Encriptador: </w:t>
       </w:r>
     </w:p>
     <w:p>
@@ -22876,28 +22663,28 @@
 </file>
 
 <file path=customXml/item1.xml><?xml version="1.0" encoding="utf-8"?>
-<b:Sources xmlns:b="http://schemas.openxmlformats.org/officeDocument/2006/bibliography" xmlns="http://schemas.openxmlformats.org/officeDocument/2006/bibliography" SelectedStyle="\APASixthEditionOfficeOnline.xsl" StyleName="APA" Version="6"/>
-</file>
-
-<file path=customXml/item2.xml><?xml version="1.0" encoding="utf-8"?>
 <go:gDocsCustomXmlDataStorage xmlns:go="http://customooxmlschemas.google.com/" xmlns:r="http://schemas.openxmlformats.org/officeDocument/2006/relationships" uri="GoogleDocsCustomDataVersion2">
   <go:docsCustomData xmlns:go="http://customooxmlschemas.google.com/" roundtripDataSignature="AMtx7mg9ViIy0TFX1PbiokUHW0+gEHD0DQ==">CgMxLjAyDmgueXB0b3ptdnN5YWhpMg5oLjMwMTZ1a3NyeWs5OTIOaC41dHdvajgxajFna2EyDmguajh3ZGR4ZWVnZ3R3Mg5oLmJneml2aG00bzdoYzIOaC5qOTJ5aWxicjl6dDcyDmgubjRpdXVhbG9heDc2Mg5oLjFpNzZ2NHk0NXc5OTIOaC5oaHFvaTRybTJzYjEyDmgubGF1ZXZ5aGhzMG5uMg5oLjI5Nmd4eXhiYnYwbTgAciExNlVkVkNiWlZIdUNvcHFuMnNIenVkMWZoTjV5TjIzLW4=</go:docsCustomData>
 </go:gDocsCustomXmlDataStorage>
 </file>
 
-<file path=customXml/itemProps1.xml><?xml version="1.0" encoding="utf-8"?>
-<ds:datastoreItem xmlns:ds="http://schemas.openxmlformats.org/officeDocument/2006/customXml" ds:itemID="{98C402C2-0B0B-45E1-8B8A-FD895BAD112E}">
-  <ds:schemaRefs>
-    <ds:schemaRef ds:uri="http://schemas.openxmlformats.org/officeDocument/2006/bibliography"/>
-  </ds:schemaRefs>
-</ds:datastoreItem>
+<file path=customXml/item2.xml><?xml version="1.0" encoding="utf-8"?>
+<b:Sources xmlns:b="http://schemas.openxmlformats.org/officeDocument/2006/bibliography" xmlns="http://schemas.openxmlformats.org/officeDocument/2006/bibliography" SelectedStyle="\APASixthEditionOfficeOnline.xsl" StyleName="APA" Version="6"/>
 </file>
 
-<file path=customXml/itemProps2.xml><?xml version="1.0" encoding="utf-8"?>
+<file path=customXml/itemProps1.xml><?xml version="1.0" encoding="utf-8"?>
 <ds:datastoreItem xmlns:ds="http://schemas.openxmlformats.org/officeDocument/2006/customXml" ds:itemID="{11111111-1234-1234-1234-123412341234}">
   <ds:schemaRefs>
     <ds:schemaRef ds:uri="http://customooxmlschemas.google.com/"/>
     <ds:schemaRef ds:uri="http://schemas.openxmlformats.org/officeDocument/2006/relationships"/>
   </ds:schemaRefs>
 </ds:datastoreItem>
+</file>
+
+<file path=customXml/itemProps2.xml><?xml version="1.0" encoding="utf-8"?>
+<ds:datastoreItem xmlns:ds="http://schemas.openxmlformats.org/officeDocument/2006/customXml" ds:itemID="{98C402C2-0B0B-45E1-8B8A-FD895BAD112E}">
+  <ds:schemaRefs>
+    <ds:schemaRef ds:uri="http://schemas.openxmlformats.org/officeDocument/2006/bibliography"/>
+  </ds:schemaRefs>
+</ds:datastoreItem>
 </file>
</xml_diff>